<commit_message>
Add Bab 3 storytelling notes, Canva scripts, C3-C4 mini tests, and teacher word-by-word dialogue
</commit_message>
<xml_diff>
--- a/docs/Naskah_Guru_dan_Materi_Pancasila_PAI_Bab3.docx
+++ b/docs/Naskah_Guru_dan_Materi_Pancasila_PAI_Bab3.docx
@@ -2,46 +2,118 @@
 <file path=word/document.xml><?xml version="1.0" encoding="utf-8"?>
 <w:document xmlns:wpc="http://schemas.microsoft.com/office/word/2010/wordprocessingCanvas" xmlns:mo="http://schemas.microsoft.com/office/mac/office/2008/main" xmlns:mc="http://schemas.openxmlformats.org/markup-compatibility/2006" xmlns:mv="urn:schemas-microsoft-com:mac:vml" xmlns:o="urn:schemas-microsoft-com:office:office" xmlns:r="http://schemas.openxmlformats.org/officeDocument/2006/relationships" xmlns:m="http://schemas.openxmlformats.org/officeDocument/2006/math" xmlns:v="urn:schemas-microsoft-com:vml" xmlns:wp14="http://schemas.microsoft.com/office/word/2010/wordprocessingDrawing" xmlns:wp="http://schemas.openxmlformats.org/drawingml/2006/wordprocessingDrawing" xmlns:w10="urn:schemas-microsoft-com:office:word" xmlns:w="http://schemas.openxmlformats.org/wordprocessingml/2006/main" xmlns:w14="http://schemas.microsoft.com/office/word/2010/wordml" xmlns:wpg="http://schemas.microsoft.com/office/word/2010/wordprocessingGroup" xmlns:wpi="http://schemas.microsoft.com/office/word/2010/wordprocessingInk" xmlns:wne="http://schemas.microsoft.com/office/word/2006/wordml" xmlns:wps="http://schemas.microsoft.com/office/word/2010/wordprocessingShape" mc:Ignorable="w14 wp14">
   <w:body>
+    <w:tbl>
+      <w:tblPr>
+        <w:tblW w:type="auto" w:w="0"/>
+        <w:jc w:val="center"/>
+        <w:tblLook w:firstColumn="1" w:firstRow="1" w:lastColumn="0" w:lastRow="0" w:noHBand="0" w:noVBand="1" w:val="04A0"/>
+      </w:tblPr>
+      <w:tblGrid>
+        <w:gridCol w:w="9792"/>
+      </w:tblGrid>
+      <w:tr>
+        <w:tc>
+          <w:tcPr>
+            <w:tcW w:type="dxa" w:w="9792"/>
+            <w:shd w:val="clear" w:color="auto" w:fill="312E81"/>
+            <w:tcMar>
+              <w:top w:w="240" w:type="dxa"/>
+              <w:bottom w:w="240" w:type="dxa"/>
+              <w:left w:w="260" w:type="dxa"/>
+              <w:right w:w="260" w:type="dxa"/>
+            </w:tcMar>
+          </w:tcPr>
+          <w:p>
+            <w:pPr>
+              <w:jc w:val="center"/>
+            </w:pPr>
+            <w:r>
+              <w:rPr>
+                <w:rFonts w:ascii="Calibri" w:hAnsi="Calibri"/>
+                <w:b/>
+                <w:color w:val="FDE047"/>
+                <w:sz w:val="20"/>
+              </w:rPr>
+              <w:t>⭐ PANDUAN EKSKLUSIF PENGAJAR ⭐</w:t>
+              <w:br/>
+            </w:r>
+            <w:r>
+              <w:rPr>
+                <w:rFonts w:ascii="Calibri" w:hAnsi="Calibri"/>
+                <w:b/>
+                <w:color w:val="FFFFFF"/>
+                <w:sz w:val="33"/>
+              </w:rPr>
+              <w:t>NASKAH GURU LENGKAP WORD-BY-WORD (EDISI STORYTELLING)</w:t>
+              <w:br/>
+            </w:r>
+            <w:r>
+              <w:rPr>
+                <w:rFonts w:ascii="Calibri" w:hAnsi="Calibri"/>
+                <w:i/>
+                <w:color w:val="E0E7FF"/>
+                <w:sz w:val="20"/>
+              </w:rPr>
+              <w:t>Pendidikan Pancasila &amp; PAI-BP Bab 3 • Mengadopsi Pendekatan Storytelling Pak Gita Wirjawan</w:t>
+              <w:br/>
+              <w:t>Jadwal: Senin (Pancasila Online), Selasa (PAI Online), Rabu-Kamis (On-site Multigrade)</w:t>
+              <w:br/>
+              <w:t>PKBM Penerus Bangsa • Tahun Ajaran 2026/2027</w:t>
+            </w:r>
+          </w:p>
+        </w:tc>
+      </w:tr>
+    </w:tbl>
+    <w:p/>
     <w:p>
       <w:pPr>
-        <w:spacing w:before="0" w:after="40"/>
-        <w:jc w:val="center"/>
+        <w:pStyle w:val="Heading1"/>
       </w:pPr>
       <w:r>
-        <w:rPr>
-          <w:rFonts w:ascii="Arial" w:hAnsi="Arial"/>
-          <w:b/>
-          <w:color w:val="64748B"/>
-          <w:sz w:val="19"/>
-        </w:rPr>
-        <w:t>PKBM PENERUS BANGSA • TAHUN AJARAN 2026/2027</w:t>
-        <w:br/>
-      </w:r>
-      <w:r>
-        <w:rPr>
-          <w:rFonts w:ascii="Arial" w:hAnsi="Arial"/>
-          <w:b/>
-          <w:color w:val="BE123C"/>
-          <w:sz w:val="28"/>
-        </w:rPr>
-        <w:t>PANDUAN LENGKAP GURU (WORD-BY-WORD) &amp; LEMBAR MATERI RESMI</w:t>
-        <w:br/>
-        <w:t>BAB 3: PENDIDIKAN PANCASILA &amp; PAI (MULTIGRADE)</w:t>
+        <w:t>🎙️ PROTOKOL MENGAJAR ALA GITA WIRJAWAN (PEDAGOGI CERITA &amp; DIALOG)</w:t>
       </w:r>
     </w:p>
     <w:p>
       <w:pPr>
-        <w:spacing w:after="240"/>
-        <w:jc w:val="center"/>
+        <w:spacing w:line="276" w:lineRule="auto"/>
+      </w:pPr>
+      <w:r>
+        <w:t>1. Hook Kisah Kehidupan Nyata: Jangan buka kelas dengan 'Buka buku hal 63'. Buka dengan dilema nyata yang menyentuh hobi dan minat anak (skateboard untuk Aqlan, senam untuk Mishka, koridor sekolah untuk siswa on-site).</w:t>
+        <w:br/>
+        <w:t>2. Socratic Questioning: Gunakan pertanyaan terbuka 'Mengapa menurutmu begitu?', 'Bagaimana jika kamu di posisi dia?', bukan sekadar meminta jawaban benar/salah.</w:t>
+        <w:br/>
+        <w:t>3. Hero's Dilemma: Tampilkan pilihan sulit antara jalan pintas yang egois vs jalan ksatria yang berintegritas tinggi.</w:t>
+        <w:br/>
+        <w:t>4. Jembatan Sains &amp; Kearifan Nusantara: Ulik alasan ilmiah di balik tradisi dan budaya lokal (contoh: termodinamika rumah Honai Papua).</w:t>
+        <w:br/>
+      </w:r>
+    </w:p>
+    <w:p/>
+    <w:p>
+      <w:pPr>
+        <w:pStyle w:val="Heading1"/>
       </w:pPr>
       <w:r>
         <w:rPr>
-          <w:rFonts w:ascii="Arial" w:hAnsi="Arial"/>
+          <w:color w:val="4338CA"/>
+        </w:rPr>
+        <w:t>📅 HARI SENIN: PENDIDIKAN PANCASILA BAB 3 (ZOOM ONLINE)</w:t>
+      </w:r>
+    </w:p>
+    <w:p>
+      <w:pPr>
+        <w:pStyle w:val="Heading2"/>
+      </w:pPr>
+      <w:r>
+        <w:t>1. Sesi Aqlan (Kelas 4 - Zoom Online, Durasi 60 Menit)</w:t>
+      </w:r>
+    </w:p>
+    <w:p>
+      <w:r>
+        <w:rPr>
           <w:i/>
-          <w:color w:val="475569"/>
-          <w:sz w:val="19"/>
         </w:rPr>
-        <w:t>Struktur Sesi Online Zoom (Aqlan, Mishka) &amp; Tatap Muka Multigrade (Hasyif, Alisya, Kinanti, Ardiansyah, Shan, Aulya, Hendra, Selvi)</w:t>
+        <w:t>Topik Fokus: Kerja Sama di Lingkunganku • Gotong Royong &amp; Bahasa Persatuan • Tokoh: Aqlan &amp; Skateboard</w:t>
       </w:r>
     </w:p>
     <w:tbl>
@@ -51,117 +123,543 @@
         <w:tblLook w:firstColumn="1" w:firstRow="1" w:lastColumn="0" w:lastRow="0" w:noHBand="0" w:noVBand="1" w:val="04A0"/>
       </w:tblPr>
       <w:tblGrid>
-        <w:gridCol w:w="5040"/>
-        <w:gridCol w:w="5040"/>
+        <w:gridCol w:w="9792"/>
       </w:tblGrid>
       <w:tr>
         <w:tc>
           <w:tcPr>
-            <w:tcW w:type="dxa" w:w="5040"/>
-            <w:shd w:fill="F8FAFC"/>
+            <w:tcW w:type="dxa" w:w="9792"/>
+            <w:shd w:val="clear" w:color="auto" w:fill="EEF2FF"/>
             <w:tcMar>
-              <w:top w:w="80" w:type="dxa"/>
-              <w:bottom w:w="80" w:type="dxa"/>
-              <w:left w:w="120" w:type="dxa"/>
-              <w:right w:w="120" w:type="dxa"/>
+              <w:top w:w="120" w:type="dxa"/>
+              <w:bottom w:w="120" w:type="dxa"/>
+              <w:left w:w="150" w:type="dxa"/>
+              <w:right w:w="150" w:type="dxa"/>
             </w:tcMar>
           </w:tcPr>
           <w:p>
+            <w:pPr>
+              <w:spacing w:line="276" w:lineRule="auto"/>
+            </w:pPr>
             <w:r>
               <w:rPr>
+                <w:rFonts w:ascii="Calibri" w:hAnsi="Calibri"/>
                 <w:b/>
+                <w:color w:val="4338CA"/>
+                <w:sz w:val="21"/>
               </w:rPr>
-              <w:t xml:space="preserve">Mata Pelajaran: </w:t>
+              <w:t xml:space="preserve">[GURU TIARA [00:00 - 05:00]] </w:t>
             </w:r>
             <w:r>
-              <w:t>Pendidikan Pancasila &amp; PAI-BP</w:t>
+              <w:rPr>
+                <w:rFonts w:ascii="Calibri" w:hAnsi="Calibri"/>
+                <w:color w:val="1E293B"/>
+                <w:sz w:val="20"/>
+              </w:rPr>
+              <w:t>"Halo Aqlan! Assalamu'alaikum! Senang banget bisa ketemu Aqlan lagi hari ini di Zoom! Gimana kabar skateboard-nya? Akhir pekan kemarin sempat nyoba trik apa nih di skatepark?"</w:t>
             </w:r>
-          </w:p>
-        </w:tc>
-        <w:tc>
-          <w:tcPr>
-            <w:tcW w:type="dxa" w:w="5040"/>
-            <w:shd w:fill="F8FAFC"/>
-            <w:tcMar>
-              <w:top w:w="80" w:type="dxa"/>
-              <w:bottom w:w="80" w:type="dxa"/>
-              <w:left w:w="120" w:type="dxa"/>
-              <w:right w:w="120" w:type="dxa"/>
-            </w:tcMar>
-          </w:tcPr>
-          <w:p>
             <w:r>
               <w:rPr>
-                <w:b/>
+                <w:rFonts w:ascii="Calibri" w:hAnsi="Calibri"/>
+                <w:i/>
+                <w:color w:val="64748B"/>
+                <w:sz w:val="18"/>
               </w:rPr>
-              <w:t xml:space="preserve">Fokus Kurikulum: </w:t>
-            </w:r>
-            <w:r>
-              <w:t>BAB 3 (Semester Ganjil - Kurikulum Merdeka)</w:t>
-            </w:r>
-          </w:p>
-        </w:tc>
-      </w:tr>
-      <w:tr>
-        <w:tc>
-          <w:tcPr>
-            <w:tcW w:type="dxa" w:w="5040"/>
-            <w:shd w:fill="F8FAFC"/>
-            <w:tcMar>
-              <w:top w:w="80" w:type="dxa"/>
-              <w:bottom w:w="80" w:type="dxa"/>
-              <w:left w:w="120" w:type="dxa"/>
-              <w:right w:w="120" w:type="dxa"/>
-            </w:tcMar>
-          </w:tcPr>
-          <w:p>
-            <w:r>
-              <w:rPr>
-                <w:b/>
-              </w:rPr>
-              <w:t xml:space="preserve">Sasaran Siswa: </w:t>
-            </w:r>
-            <w:r>
-              <w:t>Kelas 4, 5, dan 6 SD / PKBM</w:t>
-            </w:r>
-          </w:p>
-        </w:tc>
-        <w:tc>
-          <w:tcPr>
-            <w:tcW w:type="dxa" w:w="5040"/>
-            <w:shd w:fill="F8FAFC"/>
-            <w:tcMar>
-              <w:top w:w="80" w:type="dxa"/>
-              <w:bottom w:w="80" w:type="dxa"/>
-              <w:left w:w="120" w:type="dxa"/>
-              <w:right w:w="120" w:type="dxa"/>
-            </w:tcMar>
-          </w:tcPr>
-          <w:p>
-            <w:r>
-              <w:rPr>
-                <w:b/>
-              </w:rPr>
-              <w:t xml:space="preserve">Media Utama: </w:t>
-            </w:r>
-            <w:r>
-              <w:t>E-Module Kemendikbud &amp; Web Game Interaktif</w:t>
+              <w:br/>
+              <w:t>💡 Catatan Guru: Bangun kedekatan emosional (rapport) berbasis minat utama Aqlan: skateboard.</w:t>
             </w:r>
           </w:p>
         </w:tc>
       </w:tr>
     </w:tbl>
+    <w:p/>
+    <w:tbl>
+      <w:tblPr>
+        <w:tblW w:type="auto" w:w="0"/>
+        <w:jc w:val="center"/>
+        <w:tblLook w:firstColumn="1" w:firstRow="1" w:lastColumn="0" w:lastRow="0" w:noHBand="0" w:noVBand="1" w:val="04A0"/>
+      </w:tblPr>
+      <w:tblGrid>
+        <w:gridCol w:w="9792"/>
+      </w:tblGrid>
+      <w:tr>
+        <w:tc>
+          <w:tcPr>
+            <w:tcW w:type="dxa" w:w="9792"/>
+            <w:shd w:val="clear" w:color="auto" w:fill="F8FAFC"/>
+            <w:tcMar>
+              <w:top w:w="120" w:type="dxa"/>
+              <w:bottom w:w="120" w:type="dxa"/>
+              <w:left w:w="150" w:type="dxa"/>
+              <w:right w:w="150" w:type="dxa"/>
+            </w:tcMar>
+          </w:tcPr>
+          <w:p>
+            <w:pPr>
+              <w:spacing w:line="276" w:lineRule="auto"/>
+            </w:pPr>
+            <w:r>
+              <w:rPr>
+                <w:rFonts w:ascii="Calibri" w:hAnsi="Calibri"/>
+                <w:b/>
+                <w:color w:val="0F766E"/>
+                <w:sz w:val="21"/>
+              </w:rPr>
+              <w:t xml:space="preserve">[AQLAN] </w:t>
+            </w:r>
+            <w:r>
+              <w:rPr>
+                <w:rFonts w:ascii="Calibri" w:hAnsi="Calibri"/>
+                <w:color w:val="1E293B"/>
+                <w:sz w:val="20"/>
+              </w:rPr>
+              <w:t>"Wa'alaikumsalam Bu Tiara! Kemarin aku latihan ollie dan manual di jalan komplek bu, tapi sempat jatuh sekali hehehe..."</w:t>
+            </w:r>
+          </w:p>
+        </w:tc>
+      </w:tr>
+    </w:tbl>
+    <w:p/>
+    <w:tbl>
+      <w:tblPr>
+        <w:tblW w:type="auto" w:w="0"/>
+        <w:jc w:val="center"/>
+        <w:tblLook w:firstColumn="1" w:firstRow="1" w:lastColumn="0" w:lastRow="0" w:noHBand="0" w:noVBand="1" w:val="04A0"/>
+      </w:tblPr>
+      <w:tblGrid>
+        <w:gridCol w:w="9792"/>
+      </w:tblGrid>
+      <w:tr>
+        <w:tc>
+          <w:tcPr>
+            <w:tcW w:type="dxa" w:w="9792"/>
+            <w:shd w:val="clear" w:color="auto" w:fill="EEF2FF"/>
+            <w:tcMar>
+              <w:top w:w="120" w:type="dxa"/>
+              <w:bottom w:w="120" w:type="dxa"/>
+              <w:left w:w="150" w:type="dxa"/>
+              <w:right w:w="150" w:type="dxa"/>
+            </w:tcMar>
+          </w:tcPr>
+          <w:p>
+            <w:pPr>
+              <w:spacing w:line="276" w:lineRule="auto"/>
+            </w:pPr>
+            <w:r>
+              <w:rPr>
+                <w:rFonts w:ascii="Calibri" w:hAnsi="Calibri"/>
+                <w:b/>
+                <w:color w:val="4338CA"/>
+                <w:sz w:val="21"/>
+              </w:rPr>
+              <w:t xml:space="preserve">[GURU TIARA [05:00 - 15:00: THE STORY HOOK]] </w:t>
+            </w:r>
+            <w:r>
+              <w:rPr>
+                <w:rFonts w:ascii="Calibri" w:hAnsi="Calibri"/>
+                <w:color w:val="1E293B"/>
+                <w:sz w:val="20"/>
+              </w:rPr>
+              <w:t>"Jatuh bangun itu bagian dari ksatria skater sejati, Aqlan! Nah, Aqlan, bayangkan cerita ini: Suatu Minggu pagi, Aqlan sudah siap pakai helm dan sepatu skate, mau meluncur ke lintasan. Tapi pas sampai di gerbang komplek, ada pohon beringin tua tumbang diterjang badai! Ranting gedenya menutup jalanan, dan selokan mampet sampai air hitam meluap. Di sana ada Pak RT sendirian pegang gergaji kecil. Pak RT bilang: 'Kalau Bapak bersihkan sendiri, butuh 5 hari, Aqlan. Nanti malam kalau hujan lagi perumahan kita kebanjiran.' Nah, kalau Aqlan di situ, apa yang Aqlan lakukan?"</w:t>
+            </w:r>
+            <w:r>
+              <w:rPr>
+                <w:rFonts w:ascii="Calibri" w:hAnsi="Calibri"/>
+                <w:i/>
+                <w:color w:val="64748B"/>
+                <w:sz w:val="18"/>
+              </w:rPr>
+              <w:br/>
+              <w:t>💡 Catatan Guru: Hadapkan anak pada dilema naratif Gita Wirjawan: membiarkan vs turun tangan.</w:t>
+            </w:r>
+          </w:p>
+        </w:tc>
+      </w:tr>
+    </w:tbl>
+    <w:p/>
+    <w:tbl>
+      <w:tblPr>
+        <w:tblW w:type="auto" w:w="0"/>
+        <w:jc w:val="center"/>
+        <w:tblLook w:firstColumn="1" w:firstRow="1" w:lastColumn="0" w:lastRow="0" w:noHBand="0" w:noVBand="1" w:val="04A0"/>
+      </w:tblPr>
+      <w:tblGrid>
+        <w:gridCol w:w="9792"/>
+      </w:tblGrid>
+      <w:tr>
+        <w:tc>
+          <w:tcPr>
+            <w:tcW w:type="dxa" w:w="9792"/>
+            <w:shd w:val="clear" w:color="auto" w:fill="F8FAFC"/>
+            <w:tcMar>
+              <w:top w:w="120" w:type="dxa"/>
+              <w:bottom w:w="120" w:type="dxa"/>
+              <w:left w:w="150" w:type="dxa"/>
+              <w:right w:w="150" w:type="dxa"/>
+            </w:tcMar>
+          </w:tcPr>
+          <w:p>
+            <w:pPr>
+              <w:spacing w:line="276" w:lineRule="auto"/>
+            </w:pPr>
+            <w:r>
+              <w:rPr>
+                <w:rFonts w:ascii="Calibri" w:hAnsi="Calibri"/>
+                <w:b/>
+                <w:color w:val="0F766E"/>
+                <w:sz w:val="21"/>
+              </w:rPr>
+              <w:t xml:space="preserve">[AQLAN] </w:t>
+            </w:r>
+            <w:r>
+              <w:rPr>
+                <w:rFonts w:ascii="Calibri" w:hAnsi="Calibri"/>
+                <w:color w:val="1E293B"/>
+                <w:sz w:val="20"/>
+              </w:rPr>
+              <w:t>"Aku nggak bisa lewatin jalan itu bu, aku panggil teman-teman buat bantuin Pak RT!"</w:t>
+            </w:r>
+          </w:p>
+        </w:tc>
+      </w:tr>
+    </w:tbl>
+    <w:p/>
+    <w:tbl>
+      <w:tblPr>
+        <w:tblW w:type="auto" w:w="0"/>
+        <w:jc w:val="center"/>
+        <w:tblLook w:firstColumn="1" w:firstRow="1" w:lastColumn="0" w:lastRow="0" w:noHBand="0" w:noVBand="1" w:val="04A0"/>
+      </w:tblPr>
+      <w:tblGrid>
+        <w:gridCol w:w="9792"/>
+      </w:tblGrid>
+      <w:tr>
+        <w:tc>
+          <w:tcPr>
+            <w:tcW w:type="dxa" w:w="9792"/>
+            <w:shd w:val="clear" w:color="auto" w:fill="EEF2FF"/>
+            <w:tcMar>
+              <w:top w:w="120" w:type="dxa"/>
+              <w:bottom w:w="120" w:type="dxa"/>
+              <w:left w:w="150" w:type="dxa"/>
+              <w:right w:w="150" w:type="dxa"/>
+            </w:tcMar>
+          </w:tcPr>
+          <w:p>
+            <w:pPr>
+              <w:spacing w:line="276" w:lineRule="auto"/>
+            </w:pPr>
+            <w:r>
+              <w:rPr>
+                <w:rFonts w:ascii="Calibri" w:hAnsi="Calibri"/>
+                <w:b/>
+                <w:color w:val="4338CA"/>
+                <w:sz w:val="21"/>
+              </w:rPr>
+              <w:t xml:space="preserve">[GURU TIARA [15:00 - 30:00: SOCRATIC DIALOGUE &amp; FILOSOFI SAPU LIDI]] </w:t>
+            </w:r>
+            <w:r>
+              <w:rPr>
+                <w:rFonts w:ascii="Calibri" w:hAnsi="Calibri"/>
+                <w:color w:val="1E293B"/>
+                <w:sz w:val="20"/>
+              </w:rPr>
+              <w:t>"Keren banget! Aqlan tahu filosofi sapu lidi? Kalau Bu Tiara kasih Aqlan satu batang lidi buat nyapu lapangan basket, apa yang terjadi sama lidinya?"</w:t>
+            </w:r>
+            <w:r>
+              <w:rPr>
+                <w:rFonts w:ascii="Calibri" w:hAnsi="Calibri"/>
+                <w:i/>
+                <w:color w:val="64748B"/>
+                <w:sz w:val="18"/>
+              </w:rPr>
+              <w:br/>
+              <w:t>💡 Catatan Guru: Gunakan analogi visual konkret.</w:t>
+            </w:r>
+          </w:p>
+        </w:tc>
+      </w:tr>
+    </w:tbl>
+    <w:p/>
+    <w:tbl>
+      <w:tblPr>
+        <w:tblW w:type="auto" w:w="0"/>
+        <w:jc w:val="center"/>
+        <w:tblLook w:firstColumn="1" w:firstRow="1" w:lastColumn="0" w:lastRow="0" w:noHBand="0" w:noVBand="1" w:val="04A0"/>
+      </w:tblPr>
+      <w:tblGrid>
+        <w:gridCol w:w="9792"/>
+      </w:tblGrid>
+      <w:tr>
+        <w:tc>
+          <w:tcPr>
+            <w:tcW w:type="dxa" w:w="9792"/>
+            <w:shd w:val="clear" w:color="auto" w:fill="F8FAFC"/>
+            <w:tcMar>
+              <w:top w:w="120" w:type="dxa"/>
+              <w:bottom w:w="120" w:type="dxa"/>
+              <w:left w:w="150" w:type="dxa"/>
+              <w:right w:w="150" w:type="dxa"/>
+            </w:tcMar>
+          </w:tcPr>
+          <w:p>
+            <w:pPr>
+              <w:spacing w:line="276" w:lineRule="auto"/>
+            </w:pPr>
+            <w:r>
+              <w:rPr>
+                <w:rFonts w:ascii="Calibri" w:hAnsi="Calibri"/>
+                <w:b/>
+                <w:color w:val="0F766E"/>
+                <w:sz w:val="21"/>
+              </w:rPr>
+              <w:t xml:space="preserve">[AQLAN] </w:t>
+            </w:r>
+            <w:r>
+              <w:rPr>
+                <w:rFonts w:ascii="Calibri" w:hAnsi="Calibri"/>
+                <w:color w:val="1E293B"/>
+                <w:sz w:val="20"/>
+              </w:rPr>
+              <w:t>"Langsung patah bu! Nggak bakal bisa nyapu lapangan!"</w:t>
+            </w:r>
+          </w:p>
+        </w:tc>
+      </w:tr>
+    </w:tbl>
+    <w:p/>
+    <w:tbl>
+      <w:tblPr>
+        <w:tblW w:type="auto" w:w="0"/>
+        <w:jc w:val="center"/>
+        <w:tblLook w:firstColumn="1" w:firstRow="1" w:lastColumn="0" w:lastRow="0" w:noHBand="0" w:noVBand="1" w:val="04A0"/>
+      </w:tblPr>
+      <w:tblGrid>
+        <w:gridCol w:w="9792"/>
+      </w:tblGrid>
+      <w:tr>
+        <w:tc>
+          <w:tcPr>
+            <w:tcW w:type="dxa" w:w="9792"/>
+            <w:shd w:val="clear" w:color="auto" w:fill="EEF2FF"/>
+            <w:tcMar>
+              <w:top w:w="120" w:type="dxa"/>
+              <w:bottom w:w="120" w:type="dxa"/>
+              <w:left w:w="150" w:type="dxa"/>
+              <w:right w:w="150" w:type="dxa"/>
+            </w:tcMar>
+          </w:tcPr>
+          <w:p>
+            <w:pPr>
+              <w:spacing w:line="276" w:lineRule="auto"/>
+            </w:pPr>
+            <w:r>
+              <w:rPr>
+                <w:rFonts w:ascii="Calibri" w:hAnsi="Calibri"/>
+                <w:b/>
+                <w:color w:val="4338CA"/>
+                <w:sz w:val="21"/>
+              </w:rPr>
+              <w:t xml:space="preserve">[GURU TIARA] </w:t>
+            </w:r>
+            <w:r>
+              <w:rPr>
+                <w:rFonts w:ascii="Calibri" w:hAnsi="Calibri"/>
+                <w:color w:val="1E293B"/>
+                <w:sz w:val="20"/>
+              </w:rPr>
+              <w:t>"Tepat sekali! Tapi kalau seratus lidi diikat kencang jadi satu ikatan sapu lidi, lapangan yang penuh daun dan batu langsung bersih dalam 10 menit! Itulah Gotong Royong, nilai luhur Pancasila Sila ke-3: Persatuan Indonesia. Di buku Pendidikan Pancasila Bab 3 kita, gotong royong punya 4 kehebatan: 1) Kerja berat jadi ringan, 2) Selesai super cepat, 3) Hemat biaya, dan 4) Bikin warga rukun! Di komplek Aqlan kan sukunya beda-beda, ada orang Jawa, Sunda, Batak, Minang. Bahasa apa yang dipakai saat kerja bakti biar semua saling mengerti?"</w:t>
+            </w:r>
+            <w:r>
+              <w:rPr>
+                <w:rFonts w:ascii="Calibri" w:hAnsi="Calibri"/>
+                <w:i/>
+                <w:color w:val="64748B"/>
+                <w:sz w:val="18"/>
+              </w:rPr>
+              <w:br/>
+              <w:t>💡 Catatan Guru: Kaitkan dengan konsep buku teks Kemendikbud hal. 63-94.</w:t>
+            </w:r>
+          </w:p>
+        </w:tc>
+      </w:tr>
+    </w:tbl>
+    <w:p/>
+    <w:tbl>
+      <w:tblPr>
+        <w:tblW w:type="auto" w:w="0"/>
+        <w:jc w:val="center"/>
+        <w:tblLook w:firstColumn="1" w:firstRow="1" w:lastColumn="0" w:lastRow="0" w:noHBand="0" w:noVBand="1" w:val="04A0"/>
+      </w:tblPr>
+      <w:tblGrid>
+        <w:gridCol w:w="9792"/>
+      </w:tblGrid>
+      <w:tr>
+        <w:tc>
+          <w:tcPr>
+            <w:tcW w:type="dxa" w:w="9792"/>
+            <w:shd w:val="clear" w:color="auto" w:fill="F8FAFC"/>
+            <w:tcMar>
+              <w:top w:w="120" w:type="dxa"/>
+              <w:bottom w:w="120" w:type="dxa"/>
+              <w:left w:w="150" w:type="dxa"/>
+              <w:right w:w="150" w:type="dxa"/>
+            </w:tcMar>
+          </w:tcPr>
+          <w:p>
+            <w:pPr>
+              <w:spacing w:line="276" w:lineRule="auto"/>
+            </w:pPr>
+            <w:r>
+              <w:rPr>
+                <w:rFonts w:ascii="Calibri" w:hAnsi="Calibri"/>
+                <w:b/>
+                <w:color w:val="0F766E"/>
+                <w:sz w:val="21"/>
+              </w:rPr>
+              <w:t xml:space="preserve">[AQLAN] </w:t>
+            </w:r>
+            <w:r>
+              <w:rPr>
+                <w:rFonts w:ascii="Calibri" w:hAnsi="Calibri"/>
+                <w:color w:val="1E293B"/>
+                <w:sz w:val="20"/>
+              </w:rPr>
+              <w:t>"Bahasa Indonesia!"</w:t>
+            </w:r>
+          </w:p>
+        </w:tc>
+      </w:tr>
+    </w:tbl>
+    <w:p/>
+    <w:tbl>
+      <w:tblPr>
+        <w:tblW w:type="auto" w:w="0"/>
+        <w:jc w:val="center"/>
+        <w:tblLook w:firstColumn="1" w:firstRow="1" w:lastColumn="0" w:lastRow="0" w:noHBand="0" w:noVBand="1" w:val="04A0"/>
+      </w:tblPr>
+      <w:tblGrid>
+        <w:gridCol w:w="9792"/>
+      </w:tblGrid>
+      <w:tr>
+        <w:tc>
+          <w:tcPr>
+            <w:tcW w:type="dxa" w:w="9792"/>
+            <w:shd w:val="clear" w:color="auto" w:fill="EEF2FF"/>
+            <w:tcMar>
+              <w:top w:w="120" w:type="dxa"/>
+              <w:bottom w:w="120" w:type="dxa"/>
+              <w:left w:w="150" w:type="dxa"/>
+              <w:right w:w="150" w:type="dxa"/>
+            </w:tcMar>
+          </w:tcPr>
+          <w:p>
+            <w:pPr>
+              <w:spacing w:line="276" w:lineRule="auto"/>
+            </w:pPr>
+            <w:r>
+              <w:rPr>
+                <w:rFonts w:ascii="Calibri" w:hAnsi="Calibri"/>
+                <w:b/>
+                <w:color w:val="4338CA"/>
+                <w:sz w:val="21"/>
+              </w:rPr>
+              <w:t xml:space="preserve">[GURU TIARA [30:00 - 50:00: GAME INTERAKTIF BAB 3]] </w:t>
+            </w:r>
+            <w:r>
+              <w:rPr>
+                <w:rFonts w:ascii="Calibri" w:hAnsi="Calibri"/>
+                <w:color w:val="1E293B"/>
+                <w:sz w:val="20"/>
+              </w:rPr>
+              <w:t>"Hebat 100! Bahasa Indonesia menyatukan kita sejak Sumpah Pemuda 1928. Sekarang, ayo Aqlan buka layar game kita di https://tiara-dwi.github.io/pkbm-games/bab3.html, pilih nama 'Aqlan', lalu klik Game 1. Di situ ada misi simulasi membersihkan ranting dan saluran air!"</w:t>
+            </w:r>
+            <w:r>
+              <w:rPr>
+                <w:rFonts w:ascii="Calibri" w:hAnsi="Calibri"/>
+                <w:i/>
+                <w:color w:val="64748B"/>
+                <w:sz w:val="18"/>
+              </w:rPr>
+              <w:br/>
+              <w:t>💡 Catatan Guru: Bimbing Aqlan mencoba game online secara langsung.</w:t>
+            </w:r>
+          </w:p>
+        </w:tc>
+      </w:tr>
+    </w:tbl>
+    <w:p/>
+    <w:tbl>
+      <w:tblPr>
+        <w:tblW w:type="auto" w:w="0"/>
+        <w:jc w:val="center"/>
+        <w:tblLook w:firstColumn="1" w:firstRow="1" w:lastColumn="0" w:lastRow="0" w:noHBand="0" w:noVBand="1" w:val="04A0"/>
+      </w:tblPr>
+      <w:tblGrid>
+        <w:gridCol w:w="9792"/>
+      </w:tblGrid>
+      <w:tr>
+        <w:tc>
+          <w:tcPr>
+            <w:tcW w:type="dxa" w:w="9792"/>
+            <w:shd w:val="clear" w:color="auto" w:fill="EEF2FF"/>
+            <w:tcMar>
+              <w:top w:w="120" w:type="dxa"/>
+              <w:bottom w:w="120" w:type="dxa"/>
+              <w:left w:w="150" w:type="dxa"/>
+              <w:right w:w="150" w:type="dxa"/>
+            </w:tcMar>
+          </w:tcPr>
+          <w:p>
+            <w:pPr>
+              <w:spacing w:line="276" w:lineRule="auto"/>
+            </w:pPr>
+            <w:r>
+              <w:rPr>
+                <w:rFonts w:ascii="Calibri" w:hAnsi="Calibri"/>
+                <w:b/>
+                <w:color w:val="4338CA"/>
+                <w:sz w:val="21"/>
+              </w:rPr>
+              <w:t xml:space="preserve">[GURU TIARA [50:00 - 60:00: EVALUASI C3 &amp; REFLEKSI]] </w:t>
+            </w:r>
+            <w:r>
+              <w:rPr>
+                <w:rFonts w:ascii="Calibri" w:hAnsi="Calibri"/>
+                <w:color w:val="1E293B"/>
+                <w:sz w:val="20"/>
+              </w:rPr>
+              <w:t>"Alhamdulillah, skor Aqlan sempurna 100! Satu tantangan ksatria buat Aqlan hari ini: coba sebutkan satu aksi gotong royong kecil yang bisa Aqlan lakukan di rumah bareng Ayah dan Bunda setelah Zoom ini?"</w:t>
+            </w:r>
+            <w:r>
+              <w:rPr>
+                <w:rFonts w:ascii="Calibri" w:hAnsi="Calibri"/>
+                <w:i/>
+                <w:color w:val="64748B"/>
+                <w:sz w:val="18"/>
+              </w:rPr>
+              <w:br/>
+              <w:t>💡 Catatan Guru: Aplikasi konkret (Bloom C3) dalam kehidupan nyata.</w:t>
+            </w:r>
+          </w:p>
+        </w:tc>
+      </w:tr>
+    </w:tbl>
+    <w:p/>
     <w:p>
       <w:pPr>
-        <w:spacing w:before="120" w:after="120"/>
+        <w:pStyle w:val="Heading2"/>
       </w:pPr>
+      <w:r>
+        <w:t>2. Sesi Mishka (Kelas 5 - Zoom Online, Durasi 60 Menit)</w:t>
+      </w:r>
     </w:p>
     <w:p>
-      <w:pPr>
-        <w:pStyle w:val="Heading1"/>
-      </w:pPr>
       <w:r>
-        <w:t>BAGIAN I: NASKAH GURU WORD-BY-WORD SESI ZOOM ONLINE</w:t>
+        <w:rPr>
+          <w:i/>
+        </w:rPr>
+        <w:t>Topik Fokus: Keragaman Budaya Indonesiaku • Sains Arsitektur Honai &amp; Tongkonan • Tokoh: Mishka &amp; Senam</w:t>
       </w:r>
     </w:p>
     <w:tbl>
@@ -171,227 +669,491 @@
         <w:tblLook w:firstColumn="1" w:firstRow="1" w:lastColumn="0" w:lastRow="0" w:noHBand="0" w:noVBand="1" w:val="04A0"/>
       </w:tblPr>
       <w:tblGrid>
-        <w:gridCol w:w="10080"/>
+        <w:gridCol w:w="9792"/>
       </w:tblGrid>
       <w:tr>
         <w:tc>
           <w:tcPr>
-            <w:tcW w:type="dxa" w:w="10080"/>
-            <w:shd w:fill="F0F9FF"/>
+            <w:tcW w:type="dxa" w:w="9792"/>
+            <w:shd w:val="clear" w:color="auto" w:fill="EEF2FF"/>
             <w:tcMar>
-              <w:top w:w="140" w:type="dxa"/>
-              <w:bottom w:w="140" w:type="dxa"/>
-              <w:left w:w="200" w:type="dxa"/>
-              <w:right w:w="200" w:type="dxa"/>
+              <w:top w:w="120" w:type="dxa"/>
+              <w:bottom w:w="120" w:type="dxa"/>
+              <w:left w:w="150" w:type="dxa"/>
+              <w:right w:w="150" w:type="dxa"/>
             </w:tcMar>
-            <w:tcBorders>
-              <w:left w:val="single" w:sz="24" w:space="0" w:color="0284C7"/>
-              <w:top w:val="none"/>
-              <w:right w:val="none"/>
-              <w:bottom w:val="none"/>
-            </w:tcBorders>
           </w:tcPr>
           <w:p>
             <w:pPr>
-              <w:spacing w:before="40" w:after="80"/>
+              <w:spacing w:line="276" w:lineRule="auto"/>
             </w:pPr>
             <w:r>
               <w:rPr>
-                <w:rFonts w:ascii="Arial" w:hAnsi="Arial"/>
+                <w:rFonts w:ascii="Calibri" w:hAnsi="Calibri"/>
                 <w:b/>
-                <w:color w:val="0284C7"/>
-                <w:sz w:val="20"/>
+                <w:color w:val="4338CA"/>
+                <w:sz w:val="21"/>
               </w:rPr>
-              <w:t>📌 CATATAN TEKNIS ZOOM (AQLAN &amp; MISHKA)</w:t>
-              <w:br/>
+              <w:t xml:space="preserve">[GURU TIARA [00:00 - 05:00]] </w:t>
             </w:r>
             <w:r>
               <w:rPr>
-                <w:rFonts w:ascii="Arial" w:hAnsi="Arial"/>
-                <w:color w:val="334155"/>
-                <w:sz w:val="19"/>
+                <w:rFonts w:ascii="Calibri" w:hAnsi="Calibri"/>
+                <w:color w:val="1E293B"/>
+                <w:sz w:val="20"/>
               </w:rPr>
-              <w:t>Sesi Zoom berlangsung 60 menit per anak secara bergantian (Sesi 1: Aqlan Kelas 4, Sesi 2: Mishka Kelas 5). Guru membagikan layar (Share Screen) ke portal game web: https://tiara-dwi.github.io/pkbm-games/pancasila/ dan /pai/.</w:t>
+              <w:t>"Halo Mishka! Assalamu'alaikum! Senang sekali ketemu Mishka lagi! Bagaimana latihan senam lantainya minggu ini? Kemarin sempat nyoba gerakan koreografi baru ya?"</w:t>
+            </w:r>
+            <w:r>
+              <w:rPr>
+                <w:rFonts w:ascii="Calibri" w:hAnsi="Calibri"/>
+                <w:i/>
+                <w:color w:val="64748B"/>
+                <w:sz w:val="18"/>
+              </w:rPr>
+              <w:br/>
+              <w:t>💡 Catatan Guru: Apersepsi hangat berbasis minat Mishka: senam lantai dan koreografi estetik.</w:t>
             </w:r>
           </w:p>
         </w:tc>
       </w:tr>
     </w:tbl>
+    <w:p/>
+    <w:tbl>
+      <w:tblPr>
+        <w:tblW w:type="auto" w:w="0"/>
+        <w:jc w:val="center"/>
+        <w:tblLook w:firstColumn="1" w:firstRow="1" w:lastColumn="0" w:lastRow="0" w:noHBand="0" w:noVBand="1" w:val="04A0"/>
+      </w:tblPr>
+      <w:tblGrid>
+        <w:gridCol w:w="9792"/>
+      </w:tblGrid>
+      <w:tr>
+        <w:tc>
+          <w:tcPr>
+            <w:tcW w:type="dxa" w:w="9792"/>
+            <w:shd w:val="clear" w:color="auto" w:fill="F8FAFC"/>
+            <w:tcMar>
+              <w:top w:w="120" w:type="dxa"/>
+              <w:bottom w:w="120" w:type="dxa"/>
+              <w:left w:w="150" w:type="dxa"/>
+              <w:right w:w="150" w:type="dxa"/>
+            </w:tcMar>
+          </w:tcPr>
+          <w:p>
+            <w:pPr>
+              <w:spacing w:line="276" w:lineRule="auto"/>
+            </w:pPr>
+            <w:r>
+              <w:rPr>
+                <w:rFonts w:ascii="Calibri" w:hAnsi="Calibri"/>
+                <w:b/>
+                <w:color w:val="0F766E"/>
+                <w:sz w:val="21"/>
+              </w:rPr>
+              <w:t xml:space="preserve">[MISHKA] </w:t>
+            </w:r>
+            <w:r>
+              <w:rPr>
+                <w:rFonts w:ascii="Calibri" w:hAnsi="Calibri"/>
+                <w:color w:val="1E293B"/>
+                <w:sz w:val="20"/>
+              </w:rPr>
+              <w:t>"Wa'alaikumsalam Bu Tiara! Iya bu, kemarin latihan lompat dan pendaratan di matras, seru banget!"</w:t>
+            </w:r>
+          </w:p>
+        </w:tc>
+      </w:tr>
+    </w:tbl>
+    <w:p/>
+    <w:tbl>
+      <w:tblPr>
+        <w:tblW w:type="auto" w:w="0"/>
+        <w:jc w:val="center"/>
+        <w:tblLook w:firstColumn="1" w:firstRow="1" w:lastColumn="0" w:lastRow="0" w:noHBand="0" w:noVBand="1" w:val="04A0"/>
+      </w:tblPr>
+      <w:tblGrid>
+        <w:gridCol w:w="9792"/>
+      </w:tblGrid>
+      <w:tr>
+        <w:tc>
+          <w:tcPr>
+            <w:tcW w:type="dxa" w:w="9792"/>
+            <w:shd w:val="clear" w:color="auto" w:fill="EEF2FF"/>
+            <w:tcMar>
+              <w:top w:w="120" w:type="dxa"/>
+              <w:bottom w:w="120" w:type="dxa"/>
+              <w:left w:w="150" w:type="dxa"/>
+              <w:right w:w="150" w:type="dxa"/>
+            </w:tcMar>
+          </w:tcPr>
+          <w:p>
+            <w:pPr>
+              <w:spacing w:line="276" w:lineRule="auto"/>
+            </w:pPr>
+            <w:r>
+              <w:rPr>
+                <w:rFonts w:ascii="Calibri" w:hAnsi="Calibri"/>
+                <w:b/>
+                <w:color w:val="4338CA"/>
+                <w:sz w:val="21"/>
+              </w:rPr>
+              <w:t xml:space="preserve">[GURU TIARA [05:00 - 20:00: THE ARCHITECTURAL STORY]] </w:t>
+            </w:r>
+            <w:r>
+              <w:rPr>
+                <w:rFonts w:ascii="Calibri" w:hAnsi="Calibri"/>
+                <w:color w:val="1E293B"/>
+                <w:sz w:val="20"/>
+              </w:rPr>
+              <w:t>"Wah keren, keseimbangan dan keindahan senam itu luar biasa! Nah Mishka, hari ini kita bertualang ke Bab 3 Pendidikan Pancasila: 'Keragaman Budaya Indonesiaku'. Bayangkan cerita ini: Mishka diminta jadi koreografer pentas budaya di sekolah. Tapi dua teman kelompok Mishka berantem sengit. Yang satu mau panggung berbentuk Rumah Adat Tongkonan Toraja yang atapnya melengkung megah kayak perahu. Yang satu lagi ngotot mau Rumah Adat Honai Papua yang bentuknya bundar jerami tanpa jendela. Mereka saling mengejek merasa budayanya paling keren. Kalau Mishka jadi pemimpinnya, apa yang akan Mishka jelaskan kepada mereka?"</w:t>
+            </w:r>
+            <w:r>
+              <w:rPr>
+                <w:rFonts w:ascii="Calibri" w:hAnsi="Calibri"/>
+                <w:i/>
+                <w:color w:val="64748B"/>
+                <w:sz w:val="18"/>
+              </w:rPr>
+              <w:br/>
+              <w:t>💡 Catatan Guru: Studi kasus dilema budaya dan kepemimpinan.</w:t>
+            </w:r>
+          </w:p>
+        </w:tc>
+      </w:tr>
+    </w:tbl>
+    <w:p/>
+    <w:tbl>
+      <w:tblPr>
+        <w:tblW w:type="auto" w:w="0"/>
+        <w:jc w:val="center"/>
+        <w:tblLook w:firstColumn="1" w:firstRow="1" w:lastColumn="0" w:lastRow="0" w:noHBand="0" w:noVBand="1" w:val="04A0"/>
+      </w:tblPr>
+      <w:tblGrid>
+        <w:gridCol w:w="9792"/>
+      </w:tblGrid>
+      <w:tr>
+        <w:tc>
+          <w:tcPr>
+            <w:tcW w:type="dxa" w:w="9792"/>
+            <w:shd w:val="clear" w:color="auto" w:fill="F8FAFC"/>
+            <w:tcMar>
+              <w:top w:w="120" w:type="dxa"/>
+              <w:bottom w:w="120" w:type="dxa"/>
+              <w:left w:w="150" w:type="dxa"/>
+              <w:right w:w="150" w:type="dxa"/>
+            </w:tcMar>
+          </w:tcPr>
+          <w:p>
+            <w:pPr>
+              <w:spacing w:line="276" w:lineRule="auto"/>
+            </w:pPr>
+            <w:r>
+              <w:rPr>
+                <w:rFonts w:ascii="Calibri" w:hAnsi="Calibri"/>
+                <w:b/>
+                <w:color w:val="0F766E"/>
+                <w:sz w:val="21"/>
+              </w:rPr>
+              <w:t xml:space="preserve">[MISHKA] </w:t>
+            </w:r>
+            <w:r>
+              <w:rPr>
+                <w:rFonts w:ascii="Calibri" w:hAnsi="Calibri"/>
+                <w:color w:val="1E293B"/>
+                <w:sz w:val="20"/>
+              </w:rPr>
+              <w:t>"Aku bakal bilang nggak boleh saling mengejek bu. Dua-duanya bagus dan punya keunikan masing-masing."</w:t>
+            </w:r>
+          </w:p>
+        </w:tc>
+      </w:tr>
+    </w:tbl>
+    <w:p/>
+    <w:tbl>
+      <w:tblPr>
+        <w:tblW w:type="auto" w:w="0"/>
+        <w:jc w:val="center"/>
+        <w:tblLook w:firstColumn="1" w:firstRow="1" w:lastColumn="0" w:lastRow="0" w:noHBand="0" w:noVBand="1" w:val="04A0"/>
+      </w:tblPr>
+      <w:tblGrid>
+        <w:gridCol w:w="9792"/>
+      </w:tblGrid>
+      <w:tr>
+        <w:tc>
+          <w:tcPr>
+            <w:tcW w:type="dxa" w:w="9792"/>
+            <w:shd w:val="clear" w:color="auto" w:fill="EEF2FF"/>
+            <w:tcMar>
+              <w:top w:w="120" w:type="dxa"/>
+              <w:bottom w:w="120" w:type="dxa"/>
+              <w:left w:w="150" w:type="dxa"/>
+              <w:right w:w="150" w:type="dxa"/>
+            </w:tcMar>
+          </w:tcPr>
+          <w:p>
+            <w:pPr>
+              <w:spacing w:line="276" w:lineRule="auto"/>
+            </w:pPr>
+            <w:r>
+              <w:rPr>
+                <w:rFonts w:ascii="Calibri" w:hAnsi="Calibri"/>
+                <w:b/>
+                <w:color w:val="4338CA"/>
+                <w:sz w:val="21"/>
+              </w:rPr>
+              <w:t xml:space="preserve">[GURU TIARA [20:00 - 35:00: SAINS ARSITEKTUR GITA WIRJAWAN]] </w:t>
+            </w:r>
+            <w:r>
+              <w:rPr>
+                <w:rFonts w:ascii="Calibri" w:hAnsi="Calibri"/>
+                <w:color w:val="1E293B"/>
+                <w:sz w:val="20"/>
+              </w:rPr>
+              <w:t>"Pintar sekali! Dan yang luar biasa, Mishka, ini bukan cuma soal bagus-bagusan, tapi ada rahasia sainsnya! Mishka tahu nggak kenapa nenek moyang suku Dani di pegunungan Jayawijaya Papua sengaja bikin Honai bulat rapat dan nggak ada jendelanya sama sekali?"</w:t>
+            </w:r>
+            <w:r>
+              <w:rPr>
+                <w:rFonts w:ascii="Calibri" w:hAnsi="Calibri"/>
+                <w:i/>
+                <w:color w:val="64748B"/>
+                <w:sz w:val="18"/>
+              </w:rPr>
+              <w:br/>
+              <w:t>💡 Catatan Guru: Eksplorasi sains adaptasi iklim ala Gita Wirjawan.</w:t>
+            </w:r>
+          </w:p>
+        </w:tc>
+      </w:tr>
+    </w:tbl>
+    <w:p/>
+    <w:tbl>
+      <w:tblPr>
+        <w:tblW w:type="auto" w:w="0"/>
+        <w:jc w:val="center"/>
+        <w:tblLook w:firstColumn="1" w:firstRow="1" w:lastColumn="0" w:lastRow="0" w:noHBand="0" w:noVBand="1" w:val="04A0"/>
+      </w:tblPr>
+      <w:tblGrid>
+        <w:gridCol w:w="9792"/>
+      </w:tblGrid>
+      <w:tr>
+        <w:tc>
+          <w:tcPr>
+            <w:tcW w:type="dxa" w:w="9792"/>
+            <w:shd w:val="clear" w:color="auto" w:fill="F8FAFC"/>
+            <w:tcMar>
+              <w:top w:w="120" w:type="dxa"/>
+              <w:bottom w:w="120" w:type="dxa"/>
+              <w:left w:w="150" w:type="dxa"/>
+              <w:right w:w="150" w:type="dxa"/>
+            </w:tcMar>
+          </w:tcPr>
+          <w:p>
+            <w:pPr>
+              <w:spacing w:line="276" w:lineRule="auto"/>
+            </w:pPr>
+            <w:r>
+              <w:rPr>
+                <w:rFonts w:ascii="Calibri" w:hAnsi="Calibri"/>
+                <w:b/>
+                <w:color w:val="0F766E"/>
+                <w:sz w:val="21"/>
+              </w:rPr>
+              <w:t xml:space="preserve">[MISHKA] </w:t>
+            </w:r>
+            <w:r>
+              <w:rPr>
+                <w:rFonts w:ascii="Calibri" w:hAnsi="Calibri"/>
+                <w:color w:val="1E293B"/>
+                <w:sz w:val="20"/>
+              </w:rPr>
+              <w:t>"Biar hangat ya bu? Di pegunungan kan dingin banget!"</w:t>
+            </w:r>
+          </w:p>
+        </w:tc>
+      </w:tr>
+    </w:tbl>
+    <w:p/>
+    <w:tbl>
+      <w:tblPr>
+        <w:tblW w:type="auto" w:w="0"/>
+        <w:jc w:val="center"/>
+        <w:tblLook w:firstColumn="1" w:firstRow="1" w:lastColumn="0" w:lastRow="0" w:noHBand="0" w:noVBand="1" w:val="04A0"/>
+      </w:tblPr>
+      <w:tblGrid>
+        <w:gridCol w:w="9792"/>
+      </w:tblGrid>
+      <w:tr>
+        <w:tc>
+          <w:tcPr>
+            <w:tcW w:type="dxa" w:w="9792"/>
+            <w:shd w:val="clear" w:color="auto" w:fill="EEF2FF"/>
+            <w:tcMar>
+              <w:top w:w="120" w:type="dxa"/>
+              <w:bottom w:w="120" w:type="dxa"/>
+              <w:left w:w="150" w:type="dxa"/>
+              <w:right w:w="150" w:type="dxa"/>
+            </w:tcMar>
+          </w:tcPr>
+          <w:p>
+            <w:pPr>
+              <w:spacing w:line="276" w:lineRule="auto"/>
+            </w:pPr>
+            <w:r>
+              <w:rPr>
+                <w:rFonts w:ascii="Calibri" w:hAnsi="Calibri"/>
+                <w:b/>
+                <w:color w:val="4338CA"/>
+                <w:sz w:val="21"/>
+              </w:rPr>
+              <w:t xml:space="preserve">[GURU TIARA] </w:t>
+            </w:r>
+            <w:r>
+              <w:rPr>
+                <w:rFonts w:ascii="Calibri" w:hAnsi="Calibri"/>
+                <w:color w:val="1E293B"/>
+                <w:sz w:val="20"/>
+              </w:rPr>
+              <w:t>"Tepat sekali! Luar biasa cerdas analisis Mishka! Di pegunungan Papua suhunya bisa tembus 5 derajat Celcius. Bentuk melingkar tanpa celah itu menahan panas api unggun agar tidak kabur ke luar! Nenek moyang kita ratusan tahun lalu adalah ahli sains termodinamika yang hebat! Sedangkan Rumah Tongkonan dengan tiang panggung tinggi dirancang untuk mengalirkan sirkulasi udara lembap tropis di Sulawesi dan simbol nenek moyang pelaut. Keduanya adalah bukti kecerdasan nusantara!"</w:t>
+            </w:r>
+            <w:r>
+              <w:rPr>
+                <w:rFonts w:ascii="Calibri" w:hAnsi="Calibri"/>
+                <w:i/>
+                <w:color w:val="64748B"/>
+                <w:sz w:val="18"/>
+              </w:rPr>
+              <w:br/>
+              <w:t>💡 Catatan Guru: Penjelasan bermakna yang menumbuhkan rasa bangga berbudaya.</w:t>
+            </w:r>
+          </w:p>
+        </w:tc>
+      </w:tr>
+    </w:tbl>
+    <w:p/>
+    <w:tbl>
+      <w:tblPr>
+        <w:tblW w:type="auto" w:w="0"/>
+        <w:jc w:val="center"/>
+        <w:tblLook w:firstColumn="1" w:firstRow="1" w:lastColumn="0" w:lastRow="0" w:noHBand="0" w:noVBand="1" w:val="04A0"/>
+      </w:tblPr>
+      <w:tblGrid>
+        <w:gridCol w:w="9792"/>
+      </w:tblGrid>
+      <w:tr>
+        <w:tc>
+          <w:tcPr>
+            <w:tcW w:type="dxa" w:w="9792"/>
+            <w:shd w:val="clear" w:color="auto" w:fill="EEF2FF"/>
+            <w:tcMar>
+              <w:top w:w="120" w:type="dxa"/>
+              <w:bottom w:w="120" w:type="dxa"/>
+              <w:left w:w="150" w:type="dxa"/>
+              <w:right w:w="150" w:type="dxa"/>
+            </w:tcMar>
+          </w:tcPr>
+          <w:p>
+            <w:pPr>
+              <w:spacing w:line="276" w:lineRule="auto"/>
+            </w:pPr>
+            <w:r>
+              <w:rPr>
+                <w:rFonts w:ascii="Calibri" w:hAnsi="Calibri"/>
+                <w:b/>
+                <w:color w:val="4338CA"/>
+                <w:sz w:val="21"/>
+              </w:rPr>
+              <w:t xml:space="preserve">[GURU TIARA [35:00 - 50:00: GAME 2 BAB 3 &amp; ANALISIS C4]] </w:t>
+            </w:r>
+            <w:r>
+              <w:rPr>
+                <w:rFonts w:ascii="Calibri" w:hAnsi="Calibri"/>
+                <w:color w:val="1E293B"/>
+                <w:sz w:val="20"/>
+              </w:rPr>
+              <w:t>"Sekarang ayo kita uji analisis Mishka di game interaktif Bab 3 kita di https://tiara-dwi.github.io/pkbm-games/bab3.html! Pilih nama 'Mishka' dan klik Game 2. Perhatikan studi kasus arsitektur Honai dan jawab tantangannya ya!"</w:t>
+            </w:r>
+            <w:r>
+              <w:rPr>
+                <w:rFonts w:ascii="Calibri" w:hAnsi="Calibri"/>
+                <w:i/>
+                <w:color w:val="64748B"/>
+                <w:sz w:val="18"/>
+              </w:rPr>
+              <w:br/>
+              <w:t>💡 Catatan Guru: Bimbingan live game testing.</w:t>
+            </w:r>
+          </w:p>
+        </w:tc>
+      </w:tr>
+    </w:tbl>
+    <w:p/>
+    <w:tbl>
+      <w:tblPr>
+        <w:tblW w:type="auto" w:w="0"/>
+        <w:jc w:val="center"/>
+        <w:tblLook w:firstColumn="1" w:firstRow="1" w:lastColumn="0" w:lastRow="0" w:noHBand="0" w:noVBand="1" w:val="04A0"/>
+      </w:tblPr>
+      <w:tblGrid>
+        <w:gridCol w:w="9792"/>
+      </w:tblGrid>
+      <w:tr>
+        <w:tc>
+          <w:tcPr>
+            <w:tcW w:type="dxa" w:w="9792"/>
+            <w:shd w:val="clear" w:color="auto" w:fill="EEF2FF"/>
+            <w:tcMar>
+              <w:top w:w="120" w:type="dxa"/>
+              <w:bottom w:w="120" w:type="dxa"/>
+              <w:left w:w="150" w:type="dxa"/>
+              <w:right w:w="150" w:type="dxa"/>
+            </w:tcMar>
+          </w:tcPr>
+          <w:p>
+            <w:pPr>
+              <w:spacing w:line="276" w:lineRule="auto"/>
+            </w:pPr>
+            <w:r>
+              <w:rPr>
+                <w:rFonts w:ascii="Calibri" w:hAnsi="Calibri"/>
+                <w:b/>
+                <w:color w:val="4338CA"/>
+                <w:sz w:val="21"/>
+              </w:rPr>
+              <w:t xml:space="preserve">[GURU TIARA [50:00 - 60:00: REFLEKSI KOREOGRAFI HIKMAH]] </w:t>
+            </w:r>
+            <w:r>
+              <w:rPr>
+                <w:rFonts w:ascii="Calibri" w:hAnsi="Calibri"/>
+                <w:color w:val="1E293B"/>
+                <w:sz w:val="20"/>
+              </w:rPr>
+              <w:t>"Skor 100 untuk Mishka! Bayangkan jika gerakan senam Mishka memadukan kelenturan lingkaran Honai dan keagungan haluan Tongkonan, betapa indahnya harmoni keberagaman bangsa kita!"</w:t>
+            </w:r>
+            <w:r>
+              <w:rPr>
+                <w:rFonts w:ascii="Calibri" w:hAnsi="Calibri"/>
+                <w:i/>
+                <w:color w:val="64748B"/>
+                <w:sz w:val="18"/>
+              </w:rPr>
+              <w:br/>
+              <w:t>💡 Catatan Guru: Refleksi sintesis nilai estetik dan kebangsaan.</w:t>
+            </w:r>
+          </w:p>
+        </w:tc>
+      </w:tr>
+    </w:tbl>
+    <w:p/>
     <w:p>
       <w:pPr>
-        <w:spacing w:before="0" w:after="120"/>
-      </w:pPr>
-    </w:p>
-    <w:p>
-      <w:pPr>
-        <w:pStyle w:val="Heading2"/>
-      </w:pPr>
-      <w:r>
-        <w:t>1. Naskah Sesi Aqlan (Kelas 4 - Zoom Online, 60 Menit)</w:t>
-      </w:r>
-    </w:p>
-    <w:p>
-      <w:pPr>
-        <w:spacing w:before="160" w:after="40"/>
+        <w:pStyle w:val="Heading1"/>
       </w:pPr>
       <w:r>
         <w:rPr>
-          <w:rFonts w:ascii="Arial" w:hAnsi="Arial"/>
-          <w:b/>
-          <w:color w:val="0369A1"/>
-          <w:sz w:val="21"/>
+          <w:color w:val="0D9488"/>
         </w:rPr>
-        <w:t>[00:00 - 05:00] PEMBUKAAN &amp; ICE BREAKING</w:t>
-      </w:r>
-    </w:p>
-    <w:p>
-      <w:pPr>
-        <w:spacing w:before="0" w:after="120" w:line="276" w:lineRule="auto"/>
-      </w:pPr>
-      <w:r>
-        <w:rPr>
-          <w:rFonts w:ascii="Arial" w:hAnsi="Arial"/>
-          <w:sz w:val="19"/>
-        </w:rPr>
-        <w:t>[Guru]: 'Halo Aqlan! Assalamu'alaikum! Gimana kabarnya hari ini? Tadi sebelum mulai Zoom lagi asyik ngerjain apa nih?'</w:t>
-        <w:br/>
-        <w:t>[Aqlan]: (Menjawab ceria)</w:t>
-        <w:br/>
-        <w:t>[Guru]: 'Wah seru banget! Nah Aqlan, hari ini kita masuk ke petualangan baru, yaitu Bab 3! Di Pendidikan Pancasila kita akan menjelajahi Kerja Sama dan Keberagaman Lingkungan, dan di PAI kita akan belajar ayat istimewa Q.S. Al-Hujurat ayat 13 tentang indahnya saling menghargai. Siap Aqlan?'</w:t>
-      </w:r>
-    </w:p>
-    <w:p>
-      <w:pPr>
-        <w:spacing w:before="160" w:after="40"/>
-      </w:pPr>
-      <w:r>
-        <w:rPr>
-          <w:rFonts w:ascii="Arial" w:hAnsi="Arial"/>
-          <w:b/>
-          <w:color w:val="0369A1"/>
-          <w:sz w:val="21"/>
-        </w:rPr>
-        <w:t>[05:00 - 20:00] MATERI PANCASILA BAB 3: KERJA SAMA DI LINGKUNGANKU</w:t>
-      </w:r>
-    </w:p>
-    <w:p>
-      <w:pPr>
-        <w:spacing w:before="0" w:after="120" w:line="276" w:lineRule="auto"/>
-      </w:pPr>
-      <w:r>
-        <w:rPr>
-          <w:rFonts w:ascii="Arial" w:hAnsi="Arial"/>
-          <w:sz w:val="19"/>
-        </w:rPr>
-        <w:t>[Guru]: 'Aqlan, coba bayangkan di jalan dekat rumah Aqlan, ada pohon besar tumbang menutupi jalan pas hujan deras. Kalau cuma Pak RT sendirian yang memindahkan pohon itu, kira-kira bisa selesai cepat nggak?'</w:t>
-        <w:br/>
-        <w:t>[Aqlan]: 'Nggak bisa bu/kak, pohonnya berat banget!'</w:t>
-        <w:br/>
-        <w:t>[Guru]: 'Tepat sekali, Aqlan! Supaya jalanan bisa dilewati lagi, warga harus apa?'</w:t>
-        <w:br/>
-        <w:t>[Aqlan]: 'Gotong royong bersama-sama!'</w:t>
-        <w:br/>
-        <w:t>[Guru]: 'Keren! Di Bab 3 Buku Pendidikan Pancasila kita, inilah yang disebut Gotong Royong. Gotong royong itu ciri khas bangsa Indonesia yang membuat pekerjaan seberat apa pun jadi ringan dan cepat selesai. Di Indonesia juga ada ribuan suku dan bahasa daerah yang berbeda, tapi kita punya satu bahasa persatuan. Aqlan tahu bahasa apa yang menyatukan seluruh suku bangsa kita?'</w:t>
-        <w:br/>
-        <w:t>[Aqlan]: 'Bahasa Indonesia!'</w:t>
-        <w:br/>
-        <w:t>[Guru]: '100 untuk Aqlan! Bahasa Indonesia membuat kita bisa saling menyapa dan bekerja sama walau teman kita berbeda suku.'</w:t>
-      </w:r>
-    </w:p>
-    <w:p>
-      <w:pPr>
-        <w:spacing w:before="160" w:after="40"/>
-      </w:pPr>
-      <w:r>
-        <w:rPr>
-          <w:rFonts w:ascii="Arial" w:hAnsi="Arial"/>
-          <w:b/>
-          <w:color w:val="0369A1"/>
-          <w:sz w:val="21"/>
-        </w:rPr>
-        <w:t>[20:00 - 40:00] MATERI PAI BAB 3: INDAHNYA SALING MENGHARGAI DALAM KERAGAMAN</w:t>
-      </w:r>
-    </w:p>
-    <w:p>
-      <w:pPr>
-        <w:spacing w:before="0" w:after="120" w:line="276" w:lineRule="auto"/>
-      </w:pPr>
-      <w:r>
-        <w:rPr>
-          <w:rFonts w:ascii="Arial" w:hAnsi="Arial"/>
-          <w:sz w:val="19"/>
-        </w:rPr>
-        <w:t>[Guru]: 'Nah sekarang Aqlan buka layar yang Ibu/Kakak bagikan ya. Di PAI Bab 3, Allah Swt. berfirman dalam Surah Al-Hujurat ayat 13:</w:t>
-        <w:br/>
-        <w:t>Yaa ayyuhan-naasu innaa khalaqnaakum min dzakariw wa untsaa wa ja'alnaakum syu'uubaw wa qabaa'ila li-ta'aarafuu.</w:t>
-        <w:br/>
-        <w:t>Aqlan, coba dengarkan kata li-ta'aarafuu. Artinya: agar kamu saling mengenal. Menurut Aqlan, kenapa Allah nggak ciptakan semua orang di dunia ini mukanya sama, bahasanya sama, dan sukunya sama?'</w:t>
-        <w:br/>
-        <w:t>[Aqlan]: 'Supaya kita saling kenal dan saling bantu!'</w:t>
-        <w:br/>
-        <w:t>[Guru]: 'Tepat sekali, cerdas! Perbedaan itu adalah Sunnatullah (ketetapan Allah). Kalau semua orang sama, dunia jadi sepi dan nggak ada indahnya tolong-menolong. Kalau Aqlan punya teman yang berbeda agama atau suku, sikap Aqlan harus bagaimana?'</w:t>
-        <w:br/>
-        <w:t>[Aqlan]: 'Tetap berteman baik dan tidak boleh mengejek!'</w:t>
-      </w:r>
-    </w:p>
-    <w:p>
-      <w:pPr>
-        <w:spacing w:before="160" w:after="40"/>
-      </w:pPr>
-      <w:r>
-        <w:rPr>
-          <w:rFonts w:ascii="Arial" w:hAnsi="Arial"/>
-          <w:b/>
-          <w:color w:val="0369A1"/>
-          <w:sz w:val="21"/>
-        </w:rPr>
-        <w:t>[40:00 - 55:00] SIMULASI GAME WEB INTERAKTIF</w:t>
-      </w:r>
-    </w:p>
-    <w:p>
-      <w:pPr>
-        <w:spacing w:before="0" w:after="120" w:line="276" w:lineRule="auto"/>
-      </w:pPr>
-      <w:r>
-        <w:rPr>
-          <w:rFonts w:ascii="Arial" w:hAnsi="Arial"/>
-          <w:sz w:val="19"/>
-        </w:rPr>
-        <w:t>[Guru]: 'Sekarang Aqlan kendalikan layarnya ya, kita buka Game Detektif Gotong Royong dan Taman Toleransi. Pilih nama Aqlan di dropdown. Coba selesaikan Misi 1 dan Misi PAI!'</w:t>
-        <w:br/>
-        <w:t>[Aqlan bermain game, menyelesaikan soal sebab-akibat gotong royong dan ayat li-ta'arafu]</w:t>
-        <w:br/>
-        <w:t>[Guru memberikan apresiasi saat efek suara bintang berbunyi: 'Hebat, poin Aqlan bertambah 100!']</w:t>
-      </w:r>
-    </w:p>
-    <w:p>
-      <w:pPr>
-        <w:spacing w:before="160" w:after="40"/>
-      </w:pPr>
-      <w:r>
-        <w:rPr>
-          <w:rFonts w:ascii="Arial" w:hAnsi="Arial"/>
-          <w:b/>
-          <w:color w:val="0369A1"/>
-          <w:sz w:val="21"/>
-        </w:rPr>
-        <w:t>[55:00 - 60:00] REFLEKSI &amp; TIKET KELUAR ZOOM</w:t>
-      </w:r>
-    </w:p>
-    <w:p>
-      <w:pPr>
-        <w:spacing w:before="0" w:after="120" w:line="276" w:lineRule="auto"/>
-      </w:pPr>
-      <w:r>
-        <w:rPr>
-          <w:rFonts w:ascii="Arial" w:hAnsi="Arial"/>
-          <w:sz w:val="19"/>
-        </w:rPr>
-        <w:t>[Guru]: 'Alhamdulillah, hebat banget Aqlan hari ini! Sebelum Zoom ditutup, coba sebutkan 1 hal baik yang mau Aqlan lakukan hari ini sebagai wujud kerja sama di rumah?'</w:t>
-        <w:br/>
-        <w:t>[Aqlan]: 'Membantu merapikan meja makan setelah sarapan!'</w:t>
-        <w:br/>
-        <w:t>[Guru]: 'Masya Allah, mantap! Sampai ketemu di sesi berikutnya ya Aqlan. Wassalamu'alaikum!'</w:t>
+        <w:t>📅 HARI SELASA: PAI-BP BAB 3 (ZOOM ONLINE)</w:t>
       </w:r>
     </w:p>
     <w:p>
@@ -399,146 +1161,15 @@
         <w:pStyle w:val="Heading2"/>
       </w:pPr>
       <w:r>
-        <w:t>2. Naskah Sesi Mishka (Kelas 5 - Zoom Online, 60 Menit)</w:t>
-      </w:r>
-    </w:p>
-    <w:p>
-      <w:pPr>
-        <w:spacing w:before="160" w:after="40"/>
-      </w:pPr>
-      <w:r>
-        <w:rPr>
-          <w:rFonts w:ascii="Arial" w:hAnsi="Arial"/>
-          <w:b/>
-          <w:color w:val="047857"/>
-          <w:sz w:val="21"/>
-        </w:rPr>
-        <w:t>[00:00 - 05:00] PEMBUKAAN &amp; CHECK-IN</w:t>
-      </w:r>
-    </w:p>
-    <w:p>
-      <w:pPr>
-        <w:spacing w:before="0" w:after="120" w:line="276" w:lineRule="auto"/>
-      </w:pPr>
-      <w:r>
-        <w:rPr>
-          <w:rFonts w:ascii="Arial" w:hAnsi="Arial"/>
-          <w:sz w:val="19"/>
-        </w:rPr>
-        <w:t>[Guru]: 'Halo Mishka! Assalamu'alaikum! Gimana kabar latihan senam dan sekolahnya minggu ini? Sehat ya?'</w:t>
-        <w:br/>
-        <w:t>[Mishka]: (Bercerita singkat)</w:t>
-        <w:br/>
-        <w:t>[Guru]: 'Alhamdulillah, senang mendengarnya! Hari ini kita masuk Bab 3. Di Pancasila kita akan bertualang keliling nusantara melihat rumah adat dan tarian daerah, lalu di PAI kita akan belajar misi mulia manusia sebagai Khalifah di muka bumi!'</w:t>
-      </w:r>
-    </w:p>
-    <w:p>
-      <w:pPr>
-        <w:spacing w:before="160" w:after="40"/>
-      </w:pPr>
-      <w:r>
-        <w:rPr>
-          <w:rFonts w:ascii="Arial" w:hAnsi="Arial"/>
-          <w:b/>
-          <w:color w:val="047857"/>
-          <w:sz w:val="21"/>
-        </w:rPr>
-        <w:t>[05:00 - 25:00] MATERI PANCASILA BAB 3: KERAGAMAN BUDAYA INDONESIAKU</w:t>
-      </w:r>
-    </w:p>
-    <w:p>
-      <w:pPr>
-        <w:spacing w:before="0" w:after="120" w:line="276" w:lineRule="auto"/>
-      </w:pPr>
-      <w:r>
-        <w:rPr>
-          <w:rFonts w:ascii="Arial" w:hAnsi="Arial"/>
-          <w:sz w:val="19"/>
-        </w:rPr>
-        <w:t>[Guru]: 'Mishka, Indonesia itu punya lebih dari 300 kelompok suku bangsa dan ribuan pulau. Pernah nggak Mishka melihat rumah adat yang atapnya melengkung megah seperti perahu?'</w:t>
-        <w:br/>
-        <w:t>[Mishka]: 'Pernah bu/kak, rumah adat Toraja ya?'</w:t>
-        <w:br/>
-        <w:t>[Guru]: 'Hebat banget, betul! Namanya Rumah Tongkonan dari Toraja, Sulawesi Selatan. Ada juga Rumah Gadang dari Minangkabau yang atapnya runcing seperti tanduk kerbau, dan Rumah Honai dari Papua yang atapnya bundar dari jerami tebal. Mengapa rumah adat di Indonesia bentuknya beda-beda, Mishka?'</w:t>
-        <w:br/>
-        <w:t>[Mishka]: 'Karena kondisi alam dan cuaca di tiap daerah beda-beda!'</w:t>
-        <w:br/>
-        <w:t>[Guru]: 'Pintar sekali! Di pegunungan Papua dingin, makanya Rumah Honai dibuat bundar dan tanpa jendela supaya udara hangat di dalam terjaga. Jadi, budaya itu lahir dari kearifan leluhur kita. Sebagai generasi muda, apa kewajiban Mishka terhadap budaya nusantara?'</w:t>
-        <w:br/>
-        <w:t>[Mishka]: 'Menghargai, tidak mengejek budaya lain, dan ikut melestarikannya.'</w:t>
-      </w:r>
-    </w:p>
-    <w:p>
-      <w:pPr>
-        <w:spacing w:before="160" w:after="40"/>
-      </w:pPr>
-      <w:r>
-        <w:rPr>
-          <w:rFonts w:ascii="Arial" w:hAnsi="Arial"/>
-          <w:b/>
-          <w:color w:val="047857"/>
-          <w:sz w:val="21"/>
-        </w:rPr>
-        <w:t>[25:00 - 45:00] MATERI PAI BAB 3: AKU ANAK SALEH (KHALIFAH DI BUMI)</w:t>
-      </w:r>
-    </w:p>
-    <w:p>
-      <w:pPr>
-        <w:spacing w:before="0" w:after="120" w:line="276" w:lineRule="auto"/>
-      </w:pPr>
-      <w:r>
-        <w:rPr>
-          <w:rFonts w:ascii="Arial" w:hAnsi="Arial"/>
-          <w:sz w:val="19"/>
-        </w:rPr>
-        <w:t>[Guru]: 'Nah sekarang di PAI Bab 3, ada konsep istimewa: Manusia diciptakan Allah sebagai Khalifah fil Ardh. Mishka tahu apa arti Khalifah?'</w:t>
-        <w:br/>
-        <w:t>[Mishka]: 'Pemimpin bu/kak.'</w:t>
-        <w:br/>
-        <w:t>[Guru]: 'Tepat! Pemimpin dan perawat bumi. Allah memberikan akal kepada manusia bukan untuk merusak pohon, mengotori sungai, atau menyiksa hewan, tapi untuk merawatnya. Selain merawat alam, anak saleh juga punya adab menghargai pendapat saat musyawarah. Kalau di kelas ada teman yang punya ide berbeda saat memilih tema penampilan senam atau tugas, sikap Mishka bagaimana?'</w:t>
-        <w:br/>
-        <w:t>[Mishka]: 'Mendengarkan dulu sampai temannya selesai bicara, tidak boleh memotong, lalu mencari solusi yang adil bersama.'</w:t>
-        <w:br/>
-        <w:t>[Guru]: 'Masya Allah, adab yang sangat terpuji! Itulah bukti anak saleh yang berkarakter khalifah.'</w:t>
-      </w:r>
-    </w:p>
-    <w:p>
-      <w:pPr>
-        <w:spacing w:before="160" w:after="40"/>
-      </w:pPr>
-      <w:r>
-        <w:rPr>
-          <w:rFonts w:ascii="Arial" w:hAnsi="Arial"/>
-          <w:b/>
-          <w:color w:val="047857"/>
-          <w:sz w:val="21"/>
-        </w:rPr>
-        <w:t>[45:00 - 60:00] SIMULASI GAME WEB &amp; REFLEKSI AKHIR</w:t>
-      </w:r>
-    </w:p>
-    <w:p>
-      <w:pPr>
-        <w:spacing w:before="0" w:after="120" w:line="276" w:lineRule="auto"/>
-      </w:pPr>
-      <w:r>
-        <w:rPr>
-          <w:rFonts w:ascii="Arial" w:hAnsi="Arial"/>
-          <w:sz w:val="19"/>
-        </w:rPr>
-        <w:t>[Guru mengajak Mishka bermain Game Penjelajah Budaya Nusantara dan Misi Khalifah Cilik di Web Game. Mishka mencocokkan suku Toraja dengan Tongkonan, serta memilih adab menyimak pendapat teman].</w:t>
+        <w:t>1. Sesi Aqlan (Kelas 4 PAI - Zoom Online, Durasi 60 Menit)</w:t>
       </w:r>
     </w:p>
     <w:p>
       <w:r>
-        <w:br w:type="page"/>
-      </w:r>
-    </w:p>
-    <w:p>
-      <w:pPr>
-        <w:pStyle w:val="Heading1"/>
-      </w:pPr>
-      <w:r>
-        <w:t>BAGIAN II: NASKAH GURU KELAS ON-SITE MULTIGRADE (KELAS 4, 5, 6)</w:t>
+        <w:rPr>
+          <w:i/>
+        </w:rPr>
+        <w:t>Topik Fokus: Indahnya Saling Menghargai (Q.S. Al-Hujurat: 13) • Kisah Skatepark Li-Ta'araju • Tasamuh</w:t>
       </w:r>
     </w:p>
     <w:tbl>
@@ -548,389 +1179,597 @@
         <w:tblLook w:firstColumn="1" w:firstRow="1" w:lastColumn="0" w:lastRow="0" w:noHBand="0" w:noVBand="1" w:val="04A0"/>
       </w:tblPr>
       <w:tblGrid>
-        <w:gridCol w:w="10080"/>
+        <w:gridCol w:w="9792"/>
       </w:tblGrid>
       <w:tr>
         <w:tc>
           <w:tcPr>
-            <w:tcW w:type="dxa" w:w="10080"/>
-            <w:shd w:fill="F0F9FF"/>
+            <w:tcW w:type="dxa" w:w="9792"/>
+            <w:shd w:val="clear" w:color="auto" w:fill="EEF2FF"/>
             <w:tcMar>
-              <w:top w:w="140" w:type="dxa"/>
-              <w:bottom w:w="140" w:type="dxa"/>
-              <w:left w:w="200" w:type="dxa"/>
-              <w:right w:w="200" w:type="dxa"/>
+              <w:top w:w="120" w:type="dxa"/>
+              <w:bottom w:w="120" w:type="dxa"/>
+              <w:left w:w="150" w:type="dxa"/>
+              <w:right w:w="150" w:type="dxa"/>
             </w:tcMar>
-            <w:tcBorders>
-              <w:left w:val="single" w:sz="24" w:space="0" w:color="0284C7"/>
-              <w:top w:val="none"/>
-              <w:right w:val="none"/>
-              <w:bottom w:val="none"/>
-            </w:tcBorders>
           </w:tcPr>
           <w:p>
             <w:pPr>
-              <w:spacing w:before="40" w:after="80"/>
+              <w:spacing w:line="276" w:lineRule="auto"/>
             </w:pPr>
             <w:r>
               <w:rPr>
-                <w:rFonts w:ascii="Arial" w:hAnsi="Arial"/>
+                <w:rFonts w:ascii="Calibri" w:hAnsi="Calibri"/>
                 <w:b/>
-                <w:color w:val="0284C7"/>
-                <w:sz w:val="20"/>
+                <w:color w:val="4338CA"/>
+                <w:sz w:val="21"/>
               </w:rPr>
-              <w:t>📌 STRATEGI KELAS MULTIGRADE ON-SITE</w:t>
-              <w:br/>
+              <w:t xml:space="preserve">[GURU TIARA [00:00 - 15:00: KISAH SKATEPARK &amp; MADE]] </w:t>
             </w:r>
             <w:r>
               <w:rPr>
-                <w:rFonts w:ascii="Arial" w:hAnsi="Arial"/>
-                <w:color w:val="334155"/>
-                <w:sz w:val="19"/>
+                <w:rFonts w:ascii="Calibri" w:hAnsi="Calibri"/>
+                <w:color w:val="1E293B"/>
+                <w:sz w:val="20"/>
               </w:rPr>
-              <w:t>Siswa On-site belajar di ruangan yang sama: Kelas 4 (Hasyif, Alisya, Kinanti), Kelas 5 (Ardiansyah), dan Kelas 6 (Shan, Aulya, Hendra, Selvi). Gunakan PEMANTIK SPIRAL BERSAMA di awal kelas, lalu arahkan penugasan bertingkat sesuai tingkat kelas. Untuk Alisya, siapkan meja depan dengan kartu visual bergambar.</w:t>
+              <w:t>"Assalamu'alaikum Aqlan! Hari ini di PAI Bab 3 kita kedatangan kisah baru: 'Kisah Sahabat di Skatepark'. Aqlan bayangkan di arena skatepark kota, ada anak baru bernama Made dari Bali. Roda papannya copot dan bearing-nya pecah. Beberapa anak menjauh karena Made anak baru dan logatnya beda. Tapi Aqlan datang meminjamkan kunci T-tool dan roda cadangan Aqlan. Pas azan asar berkumandang, Aqlan pamit salat, dan Made menjaga papan Aqlan dengan amanah. Pulangnya, Made memberi pie susu Bali ke Aqlan. Aqlan, apa yang membuat mereka bisa langsung akrab walau suku dan agamanya berbeda?"</w:t>
+            </w:r>
+            <w:r>
+              <w:rPr>
+                <w:rFonts w:ascii="Calibri" w:hAnsi="Calibri"/>
+                <w:i/>
+                <w:color w:val="64748B"/>
+                <w:sz w:val="18"/>
+              </w:rPr>
+              <w:br/>
+              <w:t>💡 Catatan Guru: Narasikan kisah yang menyentuh hati dan dekat dengan dunia Aqlan.</w:t>
             </w:r>
           </w:p>
         </w:tc>
       </w:tr>
     </w:tbl>
+    <w:p/>
+    <w:tbl>
+      <w:tblPr>
+        <w:tblW w:type="auto" w:w="0"/>
+        <w:jc w:val="center"/>
+        <w:tblLook w:firstColumn="1" w:firstRow="1" w:lastColumn="0" w:lastRow="0" w:noHBand="0" w:noVBand="1" w:val="04A0"/>
+      </w:tblPr>
+      <w:tblGrid>
+        <w:gridCol w:w="9792"/>
+      </w:tblGrid>
+      <w:tr>
+        <w:tc>
+          <w:tcPr>
+            <w:tcW w:type="dxa" w:w="9792"/>
+            <w:shd w:val="clear" w:color="auto" w:fill="F8FAFC"/>
+            <w:tcMar>
+              <w:top w:w="120" w:type="dxa"/>
+              <w:bottom w:w="120" w:type="dxa"/>
+              <w:left w:w="150" w:type="dxa"/>
+              <w:right w:w="150" w:type="dxa"/>
+            </w:tcMar>
+          </w:tcPr>
+          <w:p>
+            <w:pPr>
+              <w:spacing w:line="276" w:lineRule="auto"/>
+            </w:pPr>
+            <w:r>
+              <w:rPr>
+                <w:rFonts w:ascii="Calibri" w:hAnsi="Calibri"/>
+                <w:b/>
+                <w:color w:val="0F766E"/>
+                <w:sz w:val="21"/>
+              </w:rPr>
+              <w:t xml:space="preserve">[AQLAN] </w:t>
+            </w:r>
+            <w:r>
+              <w:rPr>
+                <w:rFonts w:ascii="Calibri" w:hAnsi="Calibri"/>
+                <w:color w:val="1E293B"/>
+                <w:sz w:val="20"/>
+              </w:rPr>
+              <w:t>"Karena saling peduli dan tolong-menolong bu!"</w:t>
+            </w:r>
+          </w:p>
+        </w:tc>
+      </w:tr>
+    </w:tbl>
+    <w:p/>
+    <w:tbl>
+      <w:tblPr>
+        <w:tblW w:type="auto" w:w="0"/>
+        <w:jc w:val="center"/>
+        <w:tblLook w:firstColumn="1" w:firstRow="1" w:lastColumn="0" w:lastRow="0" w:noHBand="0" w:noVBand="1" w:val="04A0"/>
+      </w:tblPr>
+      <w:tblGrid>
+        <w:gridCol w:w="9792"/>
+      </w:tblGrid>
+      <w:tr>
+        <w:tc>
+          <w:tcPr>
+            <w:tcW w:type="dxa" w:w="9792"/>
+            <w:shd w:val="clear" w:color="auto" w:fill="EEF2FF"/>
+            <w:tcMar>
+              <w:top w:w="120" w:type="dxa"/>
+              <w:bottom w:w="120" w:type="dxa"/>
+              <w:left w:w="150" w:type="dxa"/>
+              <w:right w:w="150" w:type="dxa"/>
+            </w:tcMar>
+          </w:tcPr>
+          <w:p>
+            <w:pPr>
+              <w:spacing w:line="276" w:lineRule="auto"/>
+            </w:pPr>
+            <w:r>
+              <w:rPr>
+                <w:rFonts w:ascii="Calibri" w:hAnsi="Calibri"/>
+                <w:b/>
+                <w:color w:val="4338CA"/>
+                <w:sz w:val="21"/>
+              </w:rPr>
+              <w:t xml:space="preserve">[GURU TIARA [15:00 - 35:00: MENGULIK Q.S. AL-HUJURAT: 13]] </w:t>
+            </w:r>
+            <w:r>
+              <w:rPr>
+                <w:rFonts w:ascii="Calibri" w:hAnsi="Calibri"/>
+                <w:color w:val="1E293B"/>
+                <w:sz w:val="20"/>
+              </w:rPr>
+              <w:t>"Masya Allah, tepat sekali! Di PAI Bab 3, Allah Swt. menegaskan hal ini dalam Surah Al-Hujurat ayat 13: 'Yaa ayyuhan-naasu innaa khalaqnaakum min dzakariw wa untsaa wa ja'alnaakum syu'uubaw wa qabaa'ila li-ta'aarafuu...' Artinya: 'Wahai manusia, sesungguhnya Kami menciptakan kamu dari seorang laki-laki dan perempuan, dan menjadikan kamu berbangsa-bangsa dan bersuku-suku agar kamu saling mengenal (Li-ta'arafu).' Aqlan, kenapa Allah nggak ciptakan semua orang di dunia ini mukanya sama, sukunya sama, dan makanannya sama?"</w:t>
+            </w:r>
+            <w:r>
+              <w:rPr>
+                <w:rFonts w:ascii="Calibri" w:hAnsi="Calibri"/>
+                <w:i/>
+                <w:color w:val="64748B"/>
+                <w:sz w:val="18"/>
+              </w:rPr>
+              <w:br/>
+              <w:t>💡 Catatan Guru: Socratic inquiry Gita Wirjawan pada teks kitab suci.</w:t>
+            </w:r>
+          </w:p>
+        </w:tc>
+      </w:tr>
+    </w:tbl>
+    <w:p/>
+    <w:tbl>
+      <w:tblPr>
+        <w:tblW w:type="auto" w:w="0"/>
+        <w:jc w:val="center"/>
+        <w:tblLook w:firstColumn="1" w:firstRow="1" w:lastColumn="0" w:lastRow="0" w:noHBand="0" w:noVBand="1" w:val="04A0"/>
+      </w:tblPr>
+      <w:tblGrid>
+        <w:gridCol w:w="9792"/>
+      </w:tblGrid>
+      <w:tr>
+        <w:tc>
+          <w:tcPr>
+            <w:tcW w:type="dxa" w:w="9792"/>
+            <w:shd w:val="clear" w:color="auto" w:fill="F8FAFC"/>
+            <w:tcMar>
+              <w:top w:w="120" w:type="dxa"/>
+              <w:bottom w:w="120" w:type="dxa"/>
+              <w:left w:w="150" w:type="dxa"/>
+              <w:right w:w="150" w:type="dxa"/>
+            </w:tcMar>
+          </w:tcPr>
+          <w:p>
+            <w:pPr>
+              <w:spacing w:line="276" w:lineRule="auto"/>
+            </w:pPr>
+            <w:r>
+              <w:rPr>
+                <w:rFonts w:ascii="Calibri" w:hAnsi="Calibri"/>
+                <w:b/>
+                <w:color w:val="0F766E"/>
+                <w:sz w:val="21"/>
+              </w:rPr>
+              <w:t xml:space="preserve">[AQLAN] </w:t>
+            </w:r>
+            <w:r>
+              <w:rPr>
+                <w:rFonts w:ascii="Calibri" w:hAnsi="Calibri"/>
+                <w:color w:val="1E293B"/>
+                <w:sz w:val="20"/>
+              </w:rPr>
+              <w:t>"Kalau semua sama jadi membosankan bu! Nggak ada tolong menolong!"</w:t>
+            </w:r>
+          </w:p>
+        </w:tc>
+      </w:tr>
+    </w:tbl>
+    <w:p/>
+    <w:tbl>
+      <w:tblPr>
+        <w:tblW w:type="auto" w:w="0"/>
+        <w:jc w:val="center"/>
+        <w:tblLook w:firstColumn="1" w:firstRow="1" w:lastColumn="0" w:lastRow="0" w:noHBand="0" w:noVBand="1" w:val="04A0"/>
+      </w:tblPr>
+      <w:tblGrid>
+        <w:gridCol w:w="9792"/>
+      </w:tblGrid>
+      <w:tr>
+        <w:tc>
+          <w:tcPr>
+            <w:tcW w:type="dxa" w:w="9792"/>
+            <w:shd w:val="clear" w:color="auto" w:fill="EEF2FF"/>
+            <w:tcMar>
+              <w:top w:w="120" w:type="dxa"/>
+              <w:bottom w:w="120" w:type="dxa"/>
+              <w:left w:w="150" w:type="dxa"/>
+              <w:right w:w="150" w:type="dxa"/>
+            </w:tcMar>
+          </w:tcPr>
+          <w:p>
+            <w:pPr>
+              <w:spacing w:line="276" w:lineRule="auto"/>
+            </w:pPr>
+            <w:r>
+              <w:rPr>
+                <w:rFonts w:ascii="Calibri" w:hAnsi="Calibri"/>
+                <w:b/>
+                <w:color w:val="4338CA"/>
+                <w:sz w:val="21"/>
+              </w:rPr>
+              <w:t xml:space="preserve">[GURU TIARA [35:00 - 60:00: GAME &amp; AKSI NYATA LI-TA'ARAFU]] </w:t>
+            </w:r>
+            <w:r>
+              <w:rPr>
+                <w:rFonts w:ascii="Calibri" w:hAnsi="Calibri"/>
+                <w:color w:val="1E293B"/>
+                <w:sz w:val="20"/>
+              </w:rPr>
+              <w:t>"100 untuk Aqlan! Perbedaan itu Sunnatullah agar kita saling melengkapi. Sekarang ayo buka Game 1 Bab 3 di bagian Tantangan PAI Al-Hujurat 13, selesaikan kuisnya, dan tuliskan 1 teman berbeda suku yang akan Aqlan sapa dengan ramah besok!"</w:t>
+            </w:r>
+            <w:r>
+              <w:rPr>
+                <w:rFonts w:ascii="Calibri" w:hAnsi="Calibri"/>
+                <w:i/>
+                <w:color w:val="64748B"/>
+                <w:sz w:val="18"/>
+              </w:rPr>
+              <w:br/>
+              <w:t>💡 Catatan Guru: Praktik game dan komitmen karakter.</w:t>
+            </w:r>
+          </w:p>
+        </w:tc>
+      </w:tr>
+    </w:tbl>
+    <w:p/>
     <w:p>
       <w:pPr>
-        <w:spacing w:before="0" w:after="120"/>
-      </w:pPr>
-    </w:p>
-    <w:p>
-      <w:pPr>
-        <w:spacing w:before="160" w:after="40"/>
+        <w:pStyle w:val="Heading2"/>
       </w:pPr>
       <w:r>
-        <w:rPr>
-          <w:rFonts w:ascii="Arial" w:hAnsi="Arial"/>
-          <w:b/>
-          <w:color w:val="BE123C"/>
-          <w:sz w:val="21"/>
-        </w:rPr>
-        <w:t>[APERSEPSI KLASIKAL BERSAMA - 10 MENIT]</w:t>
-      </w:r>
-    </w:p>
-    <w:p>
-      <w:pPr>
-        <w:spacing w:before="0" w:after="120" w:line="276" w:lineRule="auto"/>
-      </w:pPr>
-      <w:r>
-        <w:rPr>
-          <w:rFonts w:ascii="Arial" w:hAnsi="Arial"/>
-          <w:sz w:val="19"/>
-        </w:rPr>
-        <w:t>[Guru berdiri di depan kelas, membawa satu sapu lidi tunggal dan satu ikat sapu lidi]:</w:t>
-        <w:br/>
-        <w:t>[Guru]: 'Selamat pagi anak-anak hebat PKBM Penerus Bangsa! Hari ini kita mulai petualangan baru di BAB 3!</w:t>
-        <w:br/>
-        <w:t>Coba lihat ke meja depan. Guru punya sebatang lidi tipis. Kalau sapu lidi ini Guru pakai untuk menyapu halaman kelas yang penuh daun kering, apa yang terjadi?'</w:t>
-        <w:br/>
-        <w:t>[Hasyif &amp; Hendra]: 'Patah bu/kak! Daunnya nggak akan bersih!'</w:t>
-        <w:br/>
-        <w:t>[Guru]: 'Sekarang, kalau lidinya digabungkan menjadi ratusan batang dan diikat kuat seperti ini, apa yang terjadi?'</w:t>
-        <w:br/>
-        <w:t>[Kinanti &amp; Aulya]: 'Kuat banget bu/kak, halamannya langsung bersih sekali sapu!'</w:t>
-        <w:br/>
-        <w:t>[Guru]: 'Masya Allah, tepuk tangan untuk kita semua! Inilah rahasia kekuatan bangsa kita di BAB 3: Gotong Royong, Bersatu dalam Keragaman Budaya, serta Disiplin Menjalankan Kewajiban dan Saling Memaafkan!'</w:t>
-      </w:r>
-    </w:p>
-    <w:p>
-      <w:pPr>
-        <w:spacing w:before="160" w:after="40"/>
-      </w:pPr>
-      <w:r>
-        <w:rPr>
-          <w:rFonts w:ascii="Arial" w:hAnsi="Arial"/>
-          <w:b/>
-          <w:color w:val="BE123C"/>
-          <w:sz w:val="21"/>
-        </w:rPr>
-        <w:t>[DIREKSI KHUSUS KELAS 4: HASYIF, KINANTI &amp; PENDAMPINGAN ALISYA - 25 MENIT]</w:t>
-      </w:r>
-    </w:p>
-    <w:p>
-      <w:pPr>
-        <w:spacing w:before="0" w:after="120" w:line="276" w:lineRule="auto"/>
-      </w:pPr>
-      <w:r>
-        <w:rPr>
-          <w:rFonts w:ascii="Arial" w:hAnsi="Arial"/>
-          <w:sz w:val="19"/>
-        </w:rPr>
-        <w:t>[Guru membagikan LKPD Kelas 4 dan mendekati meja Alisya]:</w:t>
-        <w:br/>
-        <w:t>[Guru]: 'Hasyif dan Kinanti, silakan buka Bab 3 Kerja Sama di Lingkunganku. Temukan 3 manfaat gotong royong dan mengapa Bahasa Indonesia disebut bahasa persatuan.'</w:t>
-        <w:br/>
-        <w:t>[Guru berbicara lembut kepada Alisya sambil menunjukkan 2 kartu bergambar warna-warni]:</w:t>
-        <w:br/>
-        <w:t>[Guru]: 'Halo Alisya yang manis! Lihat kartu ini ya. Ini gambar anak yang sedang tersenyum membersihkan kelas bersama teman-teman (kartu hijau). Yang ini gambar anak yang cemberut dan membuang sampah sembarangan (kartu merah). Mana kartu yang baik dan membuat hati senang, Alisya?'</w:t>
-        <w:br/>
-        <w:t>[Alisya menunjuk kartu hijau].</w:t>
-        <w:br/>
-        <w:t>[Guru]: 'Pintar sekali Alisya! Tos dulu! Ayo kita tempel kartu hijau ini di pohon kebaikan Alisya ya!'</w:t>
-      </w:r>
-    </w:p>
-    <w:p>
-      <w:pPr>
-        <w:spacing w:before="160" w:after="40"/>
-      </w:pPr>
-      <w:r>
-        <w:rPr>
-          <w:rFonts w:ascii="Arial" w:hAnsi="Arial"/>
-          <w:b/>
-          <w:color w:val="BE123C"/>
-          <w:sz w:val="21"/>
-        </w:rPr>
-        <w:t>[DIREKSI KHUSUS KELAS 5: ARDIANSYAH - 25 MENIT]</w:t>
-      </w:r>
-    </w:p>
-    <w:p>
-      <w:pPr>
-        <w:spacing w:before="0" w:after="120" w:line="276" w:lineRule="auto"/>
-      </w:pPr>
-      <w:r>
-        <w:rPr>
-          <w:rFonts w:ascii="Arial" w:hAnsi="Arial"/>
-          <w:sz w:val="19"/>
-        </w:rPr>
-        <w:t>[Guru menuju meja Ardiansyah]:</w:t>
-        <w:br/>
-        <w:t>[Guru]: 'Ardiansyah, kamu adalah satu-satunya duta Kelas 5 hari ini! Coba perhatikan gambar rumah adat di LKPD-mu: Ada Rumah Gadang, Tongkonan, dan Honai. Hubungkan garisnya ke daerah asalnya. Lalu jelaskan mengapa menjaga kelestarian budaya dan alam merupakan tugas mulia seorang Khalifah di bumi.'</w:t>
-        <w:br/>
-        <w:t>[Ardiansyah mengeksplorasi modul e-book dan menuliskan analisis perbedaan iklim pegunungan Papua dan rumah Honai].</w:t>
-      </w:r>
-    </w:p>
-    <w:p>
-      <w:pPr>
-        <w:spacing w:before="160" w:after="40"/>
-      </w:pPr>
-      <w:r>
-        <w:rPr>
-          <w:rFonts w:ascii="Arial" w:hAnsi="Arial"/>
-          <w:b/>
-          <w:color w:val="BE123C"/>
-          <w:sz w:val="21"/>
-        </w:rPr>
-        <w:t>[DIREKSI KHUSUS KELAS 6: SHAN, AULYA, HENDRA, SELVI - 25 MENIT]</w:t>
-      </w:r>
-    </w:p>
-    <w:p>
-      <w:pPr>
-        <w:spacing w:before="0" w:after="120" w:line="276" w:lineRule="auto"/>
-      </w:pPr>
-      <w:r>
-        <w:rPr>
-          <w:rFonts w:ascii="Arial" w:hAnsi="Arial"/>
-          <w:sz w:val="19"/>
-        </w:rPr>
-        <w:t>[Guru memandu siswa Kelas 6 ke studi kasus etika dan kejujuran]:</w:t>
-        <w:br/>
-        <w:t>[Guru]: 'Shan, Aulya, Hendra, dan Selvi, kalian adalah calon lulusan yang menjadi teladan adik-adik kelas. Di Bab 3, tantangan kalian adalah Studi Kasus Keadilan dan Berani Jujur.</w:t>
-        <w:br/>
-        <w:t>Bayangkan situasinya: Hendra tidak sengaja menendang bola saat jam istirahat hingga memecahkan kaca pot tanaman kesayangan di ruang guru. Tidak ada saksi mata selain Shan dan Selvi. Apa opsi tindakan yang paling bermartabat menurut nilai Pancasila dan ajaran PAI tentang memaafkan?'</w:t>
-        <w:br/>
-        <w:t>[Siswa Kelas 6 berdiskusi aktif membedakan antara menutup-nutupi kesalahan (melanggar norma kesusilaan) vs berani menghadap guru meminta maaf dan bertanggung jawab (adab pemaaf dan ksatria)].</w:t>
+        <w:t>2. Sesi Mishka (Kelas 5 PAI - Zoom Online, Durasi 60 Menit)</w:t>
       </w:r>
     </w:p>
     <w:p>
       <w:r>
-        <w:br w:type="page"/>
+        <w:rPr>
+          <w:i/>
+        </w:rPr>
+        <w:t>Topik Fokus: Aku Anak Saleh: Manusia sebagai Khalifah fil Ardh • Adab Musyawarah Tanpa Amarah</w:t>
       </w:r>
     </w:p>
+    <w:tbl>
+      <w:tblPr>
+        <w:tblW w:type="auto" w:w="0"/>
+        <w:jc w:val="center"/>
+        <w:tblLook w:firstColumn="1" w:firstRow="1" w:lastColumn="0" w:lastRow="0" w:noHBand="0" w:noVBand="1" w:val="04A0"/>
+      </w:tblPr>
+      <w:tblGrid>
+        <w:gridCol w:w="9792"/>
+      </w:tblGrid>
+      <w:tr>
+        <w:tc>
+          <w:tcPr>
+            <w:tcW w:type="dxa" w:w="9792"/>
+            <w:shd w:val="clear" w:color="auto" w:fill="EEF2FF"/>
+            <w:tcMar>
+              <w:top w:w="120" w:type="dxa"/>
+              <w:bottom w:w="120" w:type="dxa"/>
+              <w:left w:w="150" w:type="dxa"/>
+              <w:right w:w="150" w:type="dxa"/>
+            </w:tcMar>
+          </w:tcPr>
+          <w:p>
+            <w:pPr>
+              <w:spacing w:line="276" w:lineRule="auto"/>
+            </w:pPr>
+            <w:r>
+              <w:rPr>
+                <w:rFonts w:ascii="Calibri" w:hAnsi="Calibri"/>
+                <w:b/>
+                <w:color w:val="4338CA"/>
+                <w:sz w:val="21"/>
+              </w:rPr>
+              <w:t xml:space="preserve">[GURU TIARA [00:00 - 15:00: KISAH SANG KHALIFAH CILIK]] </w:t>
+            </w:r>
+            <w:r>
+              <w:rPr>
+                <w:rFonts w:ascii="Calibri" w:hAnsi="Calibri"/>
+                <w:color w:val="1E293B"/>
+                <w:sz w:val="20"/>
+              </w:rPr>
+              <w:t>"Assalamu'alaikum Mishka! Hari ini di PAI Bab 3 temanya sangat agung: 'Manusia sebagai Khalifah di Muka Bumi'. Mishka pernah dengar kata 'Khalifah'? Artinya apa sih menurut Mishka?"</w:t>
+            </w:r>
+            <w:r>
+              <w:rPr>
+                <w:rFonts w:ascii="Calibri" w:hAnsi="Calibri"/>
+                <w:i/>
+                <w:color w:val="64748B"/>
+                <w:sz w:val="18"/>
+              </w:rPr>
+              <w:br/>
+              <w:t>💡 Catatan Guru: Buka dialog dengan konsep kepemimpinan bermakna.</w:t>
+            </w:r>
+          </w:p>
+        </w:tc>
+      </w:tr>
+    </w:tbl>
+    <w:p/>
+    <w:tbl>
+      <w:tblPr>
+        <w:tblW w:type="auto" w:w="0"/>
+        <w:jc w:val="center"/>
+        <w:tblLook w:firstColumn="1" w:firstRow="1" w:lastColumn="0" w:lastRow="0" w:noHBand="0" w:noVBand="1" w:val="04A0"/>
+      </w:tblPr>
+      <w:tblGrid>
+        <w:gridCol w:w="9792"/>
+      </w:tblGrid>
+      <w:tr>
+        <w:tc>
+          <w:tcPr>
+            <w:tcW w:type="dxa" w:w="9792"/>
+            <w:shd w:val="clear" w:color="auto" w:fill="F8FAFC"/>
+            <w:tcMar>
+              <w:top w:w="120" w:type="dxa"/>
+              <w:bottom w:w="120" w:type="dxa"/>
+              <w:left w:w="150" w:type="dxa"/>
+              <w:right w:w="150" w:type="dxa"/>
+            </w:tcMar>
+          </w:tcPr>
+          <w:p>
+            <w:pPr>
+              <w:spacing w:line="276" w:lineRule="auto"/>
+            </w:pPr>
+            <w:r>
+              <w:rPr>
+                <w:rFonts w:ascii="Calibri" w:hAnsi="Calibri"/>
+                <w:b/>
+                <w:color w:val="0F766E"/>
+                <w:sz w:val="21"/>
+              </w:rPr>
+              <w:t xml:space="preserve">[MISHKA] </w:t>
+            </w:r>
+            <w:r>
+              <w:rPr>
+                <w:rFonts w:ascii="Calibri" w:hAnsi="Calibri"/>
+                <w:color w:val="1E293B"/>
+                <w:sz w:val="20"/>
+              </w:rPr>
+              <w:t>"Khalifah itu pemimpin bu, yang memimpin dan menjaga bumi."</w:t>
+            </w:r>
+          </w:p>
+        </w:tc>
+      </w:tr>
+    </w:tbl>
+    <w:p/>
+    <w:tbl>
+      <w:tblPr>
+        <w:tblW w:type="auto" w:w="0"/>
+        <w:jc w:val="center"/>
+        <w:tblLook w:firstColumn="1" w:firstRow="1" w:lastColumn="0" w:lastRow="0" w:noHBand="0" w:noVBand="1" w:val="04A0"/>
+      </w:tblPr>
+      <w:tblGrid>
+        <w:gridCol w:w="9792"/>
+      </w:tblGrid>
+      <w:tr>
+        <w:tc>
+          <w:tcPr>
+            <w:tcW w:type="dxa" w:w="9792"/>
+            <w:shd w:val="clear" w:color="auto" w:fill="EEF2FF"/>
+            <w:tcMar>
+              <w:top w:w="120" w:type="dxa"/>
+              <w:bottom w:w="120" w:type="dxa"/>
+              <w:left w:w="150" w:type="dxa"/>
+              <w:right w:w="150" w:type="dxa"/>
+            </w:tcMar>
+          </w:tcPr>
+          <w:p>
+            <w:pPr>
+              <w:spacing w:line="276" w:lineRule="auto"/>
+            </w:pPr>
+            <w:r>
+              <w:rPr>
+                <w:rFonts w:ascii="Calibri" w:hAnsi="Calibri"/>
+                <w:b/>
+                <w:color w:val="4338CA"/>
+                <w:sz w:val="21"/>
+              </w:rPr>
+              <w:t xml:space="preserve">[GURU TIARA [15:00 - 35:00: DILEMA MUSYAWARAH TAMAN SEKOLAH]] </w:t>
+            </w:r>
+            <w:r>
+              <w:rPr>
+                <w:rFonts w:ascii="Calibri" w:hAnsi="Calibri"/>
+                <w:color w:val="1E293B"/>
+                <w:sz w:val="20"/>
+              </w:rPr>
+              <w:t>"Tepat sekali! Bukan pemimpin sombong, tapi perawat yang menjaga alam dan tidak berbuat kerusakan (fasad). Nah, bayangkan kelas Mishka dapat proyek bikin taman sekolah. Ada teman yang mau full apotek hidup (jahe/kunyit), ada yang mau bunga mawar warna-warni. Suasananya mulai panas sampai ada yang bentak-bentak. Sebagai cerminan seorang Khalifah, apa adab yang harus kita tunjukkan saat bermusyawarah?"</w:t>
+            </w:r>
+            <w:r>
+              <w:rPr>
+                <w:rFonts w:ascii="Calibri" w:hAnsi="Calibri"/>
+                <w:i/>
+                <w:color w:val="64748B"/>
+                <w:sz w:val="18"/>
+              </w:rPr>
+              <w:br/>
+              <w:t>💡 Catatan Guru: Eksplorasi adab komunikasi dan kendali emosi.</w:t>
+            </w:r>
+          </w:p>
+        </w:tc>
+      </w:tr>
+    </w:tbl>
+    <w:p/>
+    <w:tbl>
+      <w:tblPr>
+        <w:tblW w:type="auto" w:w="0"/>
+        <w:jc w:val="center"/>
+        <w:tblLook w:firstColumn="1" w:firstRow="1" w:lastColumn="0" w:lastRow="0" w:noHBand="0" w:noVBand="1" w:val="04A0"/>
+      </w:tblPr>
+      <w:tblGrid>
+        <w:gridCol w:w="9792"/>
+      </w:tblGrid>
+      <w:tr>
+        <w:tc>
+          <w:tcPr>
+            <w:tcW w:type="dxa" w:w="9792"/>
+            <w:shd w:val="clear" w:color="auto" w:fill="F8FAFC"/>
+            <w:tcMar>
+              <w:top w:w="120" w:type="dxa"/>
+              <w:bottom w:w="120" w:type="dxa"/>
+              <w:left w:w="150" w:type="dxa"/>
+              <w:right w:w="150" w:type="dxa"/>
+            </w:tcMar>
+          </w:tcPr>
+          <w:p>
+            <w:pPr>
+              <w:spacing w:line="276" w:lineRule="auto"/>
+            </w:pPr>
+            <w:r>
+              <w:rPr>
+                <w:rFonts w:ascii="Calibri" w:hAnsi="Calibri"/>
+                <w:b/>
+                <w:color w:val="0F766E"/>
+                <w:sz w:val="21"/>
+              </w:rPr>
+              <w:t xml:space="preserve">[MISHKA] </w:t>
+            </w:r>
+            <w:r>
+              <w:rPr>
+                <w:rFonts w:ascii="Calibri" w:hAnsi="Calibri"/>
+                <w:color w:val="1E293B"/>
+                <w:sz w:val="20"/>
+              </w:rPr>
+              <w:t>"Mendengarkan sampai selesai, nggak boleh memotong omongan teman, ngomongnya pakai bahasa yang sopan, terus cari solusi gabungan."</w:t>
+            </w:r>
+          </w:p>
+        </w:tc>
+      </w:tr>
+    </w:tbl>
+    <w:p/>
+    <w:tbl>
+      <w:tblPr>
+        <w:tblW w:type="auto" w:w="0"/>
+        <w:jc w:val="center"/>
+        <w:tblLook w:firstColumn="1" w:firstRow="1" w:lastColumn="0" w:lastRow="0" w:noHBand="0" w:noVBand="1" w:val="04A0"/>
+      </w:tblPr>
+      <w:tblGrid>
+        <w:gridCol w:w="9792"/>
+      </w:tblGrid>
+      <w:tr>
+        <w:tc>
+          <w:tcPr>
+            <w:tcW w:type="dxa" w:w="9792"/>
+            <w:shd w:val="clear" w:color="auto" w:fill="EEF2FF"/>
+            <w:tcMar>
+              <w:top w:w="120" w:type="dxa"/>
+              <w:bottom w:w="120" w:type="dxa"/>
+              <w:left w:w="150" w:type="dxa"/>
+              <w:right w:w="150" w:type="dxa"/>
+            </w:tcMar>
+          </w:tcPr>
+          <w:p>
+            <w:pPr>
+              <w:spacing w:line="276" w:lineRule="auto"/>
+            </w:pPr>
+            <w:r>
+              <w:rPr>
+                <w:rFonts w:ascii="Calibri" w:hAnsi="Calibri"/>
+                <w:b/>
+                <w:color w:val="4338CA"/>
+                <w:sz w:val="21"/>
+              </w:rPr>
+              <w:t xml:space="preserve">[GURU TIARA [35:00 - 60:00: GAME 2 PAI &amp; REFLEKSI KHALIFAH]] </w:t>
+            </w:r>
+            <w:r>
+              <w:rPr>
+                <w:rFonts w:ascii="Calibri" w:hAnsi="Calibri"/>
+                <w:color w:val="1E293B"/>
+                <w:sz w:val="20"/>
+              </w:rPr>
+              <w:t>"Luar biasa! Orang yang paling kuat adalah yang mampu menahan amarah saat bermusyawarah. Ayo buka Game 2 di https://tiara-dwi.github.io/pkbm-games/bab3.html bagian Tantangan Khalifah, buktikan kepemimpinan bijak Mishka!"</w:t>
+            </w:r>
+            <w:r>
+              <w:rPr>
+                <w:rFonts w:ascii="Calibri" w:hAnsi="Calibri"/>
+                <w:i/>
+                <w:color w:val="64748B"/>
+                <w:sz w:val="18"/>
+              </w:rPr>
+              <w:br/>
+              <w:t>💡 Catatan Guru: Verifikasi game dan penguatan karakter.</w:t>
+            </w:r>
+          </w:p>
+        </w:tc>
+      </w:tr>
+    </w:tbl>
+    <w:p/>
     <w:p>
       <w:pPr>
         <w:pStyle w:val="Heading1"/>
       </w:pPr>
       <w:r>
-        <w:t>BAGIAN III: RINGKASAN MATERI RESMI BUKU TEKS (E-MODULE KEMENDIKBUD)</w:t>
+        <w:rPr>
+          <w:color w:val="BE123C"/>
+        </w:rPr>
+        <w:t>📅 RABU - KAMIS: KELAS ON-SITE MULTIGRADE (KELAS 4, 5, 6)</w:t>
       </w:r>
     </w:p>
     <w:p>
       <w:pPr>
-        <w:spacing w:before="160" w:after="40"/>
+        <w:spacing w:line="276" w:lineRule="auto"/>
       </w:pPr>
       <w:r>
-        <w:rPr>
-          <w:rFonts w:ascii="Arial" w:hAnsi="Arial"/>
-          <w:b/>
-          <w:color w:val="0F172A"/>
-          <w:sz w:val="21"/>
-        </w:rPr>
-        <w:t>PENDIDIKAN PANCASILA KELAS 4 (BAB 3: KERJA SAMA DI LINGKUNGANKU)</w:t>
-      </w:r>
-    </w:p>
-    <w:p>
-      <w:pPr>
-        <w:spacing w:before="0" w:after="120" w:line="276" w:lineRule="auto"/>
-      </w:pPr>
-      <w:r>
-        <w:rPr>
-          <w:rFonts w:ascii="Arial" w:hAnsi="Arial"/>
-          <w:color w:val="334155"/>
-          <w:sz w:val="19"/>
-        </w:rPr>
-        <w:t>• Keragaman Sosial &amp; Budaya: Bangsa Indonesia terdiri atas ratusan suku bangsa yang memiliki adat istiadat, tarian, bahasa, dan pakaian daerah berbeda.</w:t>
+        <w:t>Apersepsi Bersama Klasikal (15 Menit):</w:t>
         <w:br/>
-        <w:t>• Makna Gotong Royong: Semangat bekerja bersama-sama tanpa pamrih untuk mencapai tujuan bersama (kebersihan, keamanan, perbaikan fasilitas).</w:t>
+        <w:t>• Guru membawa sapu lidi dan satu batang lidi ke depan kelas.</w:t>
         <w:br/>
-        <w:t>• Bahasa Indonesia sebagai Bahasa Persatuan: Berfungsi sebagai jembatan komunikasi antarsuku di seluruh pelosok tanah air sesuai ikrar Sumpah Pemuda 1928.</w:t>
-      </w:r>
-    </w:p>
-    <w:p>
-      <w:pPr>
-        <w:spacing w:before="160" w:after="40"/>
-      </w:pPr>
-      <w:r>
-        <w:rPr>
-          <w:rFonts w:ascii="Arial" w:hAnsi="Arial"/>
-          <w:b/>
-          <w:color w:val="0F172A"/>
-          <w:sz w:val="21"/>
-        </w:rPr>
-        <w:t>PENDIDIKAN PANCASILA KELAS 5 (BAB 3: KERAGAMAN BUDAYA INDONESIAKU)</w:t>
-      </w:r>
-    </w:p>
-    <w:p>
-      <w:pPr>
-        <w:spacing w:before="0" w:after="120" w:line="276" w:lineRule="auto"/>
-      </w:pPr>
-      <w:r>
-        <w:rPr>
-          <w:rFonts w:ascii="Arial" w:hAnsi="Arial"/>
-          <w:color w:val="334155"/>
-          <w:sz w:val="19"/>
-        </w:rPr>
-        <w:t>• Ragam Budaya Daerah: Rumah Tongkonan (Toraja, Sulsel), Rumah Gadang (Minangkabau, Sumbar), Rumah Honai (Papua), Rumah Joglo (Jawa Tengah/Yogyakarta).</w:t>
+        <w:t>• Guru meminta Hendra mencoba menyapu selembar kardus dengan satu lidi (patah).</w:t>
         <w:br/>
-        <w:t>• Faktor Penyebab Keragaman: Letak strategis di jalur perdagangan dunia, kondisi kepulauan, dan perbedaan iklim/kondisi alam tiap pulau.</w:t>
+        <w:t>• Guru memberikan seikat sapu lidi kepada Shan dan Kinanti (kardus tersapu bersih seketika!).</w:t>
         <w:br/>
-        <w:t>• Sikap Melestarikan Budaya: Menghargai seni tradisional suku lain, mencintai batik dan produk lokal, serta tidak merendahkan budaya daerah lain.</w:t>
-      </w:r>
-    </w:p>
-    <w:p>
-      <w:pPr>
-        <w:spacing w:before="160" w:after="40"/>
-      </w:pPr>
-      <w:r>
-        <w:rPr>
-          <w:rFonts w:ascii="Arial" w:hAnsi="Arial"/>
-          <w:b/>
-          <w:color w:val="0F172A"/>
-          <w:sz w:val="21"/>
-        </w:rPr>
-        <w:t>PENDIDIKAN PANCASILA KELAS 6 (BAB 3: NORMA, HAK, DAN KEWAJIBAN BERNEGARA)</w:t>
-      </w:r>
-    </w:p>
-    <w:p>
-      <w:pPr>
-        <w:spacing w:before="0" w:after="120" w:line="276" w:lineRule="auto"/>
-      </w:pPr>
-      <w:r>
-        <w:rPr>
-          <w:rFonts w:ascii="Arial" w:hAnsi="Arial"/>
-          <w:color w:val="334155"/>
-          <w:sz w:val="19"/>
-        </w:rPr>
-        <w:t>• Keseimbangan Hak &amp; Kewajiban: Anak memiliki hak asasi untuk mendapatkan perlindungan, kasih sayang, dan pendidikan. Namun hak tersebut harus diimbangi dengan kewajiban belajar, tertib, dan menghormati sesama.</w:t>
+        <w:t>• Guru menyampaikan narasi Gita Wirjawan: 'Inilah rahasia gotong royong dan persatuan Indonesia!'</w:t>
         <w:br/>
-        <w:t>• Kewajiban Berani Jujur: Kejujuran adalah puncak integritas moral warga negara. Berani mengakui kesalahan dan berkata benar walau dalam situasi sulit.</w:t>
-      </w:r>
-    </w:p>
-    <w:p>
-      <w:pPr>
-        <w:spacing w:before="160" w:after="40"/>
-      </w:pPr>
-      <w:r>
-        <w:rPr>
-          <w:rFonts w:ascii="Arial" w:hAnsi="Arial"/>
-          <w:b/>
-          <w:color w:val="0F172A"/>
-          <w:sz w:val="21"/>
-        </w:rPr>
-        <w:t>PAI KELAS 4 (BAB 3: INDAHNYA SALING MENGHARGAI DALAM KERAGAMAN)</w:t>
-      </w:r>
-    </w:p>
-    <w:p>
-      <w:pPr>
-        <w:spacing w:before="0" w:after="120" w:line="276" w:lineRule="auto"/>
-      </w:pPr>
-      <w:r>
-        <w:rPr>
-          <w:rFonts w:ascii="Arial" w:hAnsi="Arial"/>
-          <w:color w:val="334155"/>
-          <w:sz w:val="19"/>
-        </w:rPr>
-        <w:t>• Pesan Q.S. Al-Hujurat/49: 13: Allah menciptakan manusia berbangsa-bangsa dan bersuku-suku dengan tujuan mulia agar saling mengenal (li-ta'arafu).</w:t>
         <w:br/>
-        <w:t>• Sikap Tasamuh (Toleransi): Tidak memaksakan keyakinan kepada orang lain, menghormati hak ibadah teman yang berbeda keyakinan, dan tetap tolong-menolong dalam urusan sosial kemasyarakatan.</w:t>
-      </w:r>
-    </w:p>
-    <w:p>
-      <w:pPr>
-        <w:spacing w:before="160" w:after="40"/>
-      </w:pPr>
-      <w:r>
-        <w:rPr>
-          <w:rFonts w:ascii="Arial" w:hAnsi="Arial"/>
-          <w:b/>
-          <w:color w:val="0F172A"/>
-          <w:sz w:val="21"/>
-        </w:rPr>
-        <w:t>PAI KELAS 5 (BAB 3: AKU ANAK SALEH - KHALIFAH DI MUKA BUMI)</w:t>
-      </w:r>
-    </w:p>
-    <w:p>
-      <w:pPr>
-        <w:spacing w:before="0" w:after="120" w:line="276" w:lineRule="auto"/>
-      </w:pPr>
-      <w:r>
-        <w:rPr>
-          <w:rFonts w:ascii="Arial" w:hAnsi="Arial"/>
-          <w:color w:val="334155"/>
-          <w:sz w:val="19"/>
-        </w:rPr>
-        <w:t>• Makna Khalifah fil Ardh: Manusia dipilih Allah sebagai pengelola dan pemakmur bumi. Tugasnya merawat kelestarian lingkungan dan mencegah kerusakan (fasad).</w:t>
+        <w:t>Diferensiasi Pembelajaran Multigrade:</w:t>
         <w:br/>
-        <w:t>• Adab Musyawarah: Mendengarkan pendapat orang lain dengan lapang dada, tidak memotong pembicaraan, dan tidak memaksakan pendapat pribadi.</w:t>
-      </w:r>
-    </w:p>
-    <w:p>
-      <w:pPr>
-        <w:spacing w:before="160" w:after="40"/>
-      </w:pPr>
-      <w:r>
-        <w:rPr>
-          <w:rFonts w:ascii="Arial" w:hAnsi="Arial"/>
-          <w:b/>
-          <w:color w:val="0F172A"/>
-          <w:sz w:val="21"/>
-        </w:rPr>
-        <w:t>PAI KELAS 6 (BAB 3: HIDUP DAMAI DENGAN SALING MEMAAFKAN)</w:t>
-      </w:r>
-    </w:p>
-    <w:p>
-      <w:pPr>
-        <w:spacing w:before="0" w:after="120" w:line="276" w:lineRule="auto"/>
-      </w:pPr>
-      <w:r>
-        <w:rPr>
-          <w:rFonts w:ascii="Arial" w:hAnsi="Arial"/>
-          <w:color w:val="334155"/>
-          <w:sz w:val="19"/>
-        </w:rPr>
-        <w:t>• Makna Pemaaf: Sikap berjiwa besar melepaskan rasa sakit hati dan dendam terhadap orang yang pernah berbuat salah kepada kita.</w:t>
+        <w:t>1. Kelas 4 (Hasyif, Kinanti &amp; Alisya):</w:t>
         <w:br/>
-        <w:t>• Larangan Mendendam: Rasulullah saw. melarang mendiamkan saudara sesama muslim lebih dari 3 hari. Orang yang pertama kali menyapa dan memaafkan adalah yang paling mulia di sisi Allah Swt.</w:t>
+        <w:t xml:space="preserve">   - Hasyif &amp; Kinanti membedah kasus gotong royong saluran air desa.</w:t>
         <w:br/>
-        <w:t>• Tiga Langkah Meminta Maaf: Mengakui kesalahan secara tulus, mengucap permohonan maaf, dan bertekad tidak mengulangi perbuatan tersebut.</w:t>
+        <w:t xml:space="preserve">   - Protokol Alisya (Visual Sensory): Menggunakan kartu sentuh hijau (senang &amp; rukun merapikan mainan) vs kartu merah (cemberut merebut mainan). Guru memberi apresiasi bintang emas.</w:t>
+        <w:br/>
+        <w:t>2. Kelas 5 (Ardiansyah):</w:t>
+        <w:br/>
+        <w:t xml:space="preserve">   - Menganalisis gambar Rumah Honai Papua dan Rumah Gadang Minangkabau.</w:t>
+        <w:br/>
+        <w:t xml:space="preserve">   - Merumuskan amanah merawat pohon sekolah sebagai khalifah cilik.</w:t>
+        <w:br/>
+        <w:t>3. Kelas 6 (Shan, Hendra, Aulya, Selvi):</w:t>
+        <w:br/>
+        <w:t xml:space="preserve">   - Pementasan Role-play Dilema Moral: Shan &amp; Hendra memperagakan detik-detik vas keramik pecah di koridor sepi -&gt; memilih jalan ksatria berani jujur menghadap Kepala Sekolah.</w:t>
+        <w:br/>
+        <w:t xml:space="preserve">   - Rekonsiliasi Aulya &amp; Selvi memperagakan hadis batas marah 3 hari -&gt; salam perdamaian menghapus api dendam.</w:t>
+        <w:br/>
       </w:r>
     </w:p>
     <w:sectPr>
       <w:pgSz w:w="12240" w:h="15840"/>
-      <w:pgMar w:top="1008" w:right="1080" w:bottom="1008" w:left="1080" w:header="720" w:footer="720" w:gutter="0"/>
+      <w:pgMar w:top="1152" w:right="1224" w:bottom="1152" w:left="1224" w:header="720" w:footer="720" w:gutter="0"/>
       <w:cols w:space="720"/>
       <w:docGrid w:linePitch="360"/>
     </w:sectPr>
@@ -1361,10 +2200,10 @@
       <w:outlineLvl w:val="0"/>
     </w:pPr>
     <w:rPr>
-      <w:rFonts w:asciiTheme="majorHAnsi" w:eastAsiaTheme="majorEastAsia" w:hAnsiTheme="majorHAnsi" w:cstheme="majorBidi" w:ascii="Arial" w:hAnsi="Arial"/>
+      <w:rFonts w:asciiTheme="majorHAnsi" w:eastAsiaTheme="majorEastAsia" w:hAnsiTheme="majorHAnsi" w:cstheme="majorBidi"/>
       <w:b/>
       <w:bCs/>
-      <w:color w:val="0F172A"/>
+      <w:color w:val="365F91" w:themeColor="accent1" w:themeShade="BF"/>
       <w:sz w:val="28"/>
       <w:szCs w:val="28"/>
     </w:rPr>

</xml_diff>